<commit_message>
Whitepaper Rev 3: rotary converters, flywheel effect, cutover plan, protection coordination
Expanded Section 3.4 with detailed rotary frequency converter engineering,
flywheel energy storage (frequency regulation, power smoothing, fault
ride-through, black-start), honest losses accounting, and hydroelectric
turbine runner replacement. Added Section 3.8 on protection coordination
as ongoing process with one-time international consultant knowledge transfer.
Added Appendix A: Grid Cutover Plan using the river diversion method —
section-by-section conversion with temporary bypass conductors and bus-tie
rotary converters. Executive summary in English, chiShona, Chinyanja, and
Kiswahili (translations need native speaker review).

Co-Authored-By: Claude Opus 4.6 <noreply@anthropic.com>
</commit_message>
<xml_diff>
--- a/dist/12hz-power-grid.docx
+++ b/dist/12hz-power-grid.docx
@@ -7,12 +7,6 @@
         <w:pStyle w:val="Title"/>
       </w:pPr>
       <w:r>
-        <w:t xml:space="preserve">The</w:t>
-      </w:r>
-      <w:r>
-        <w:t xml:space="preserve"> </w:t>
-      </w:r>
-      <w:r>
         <w:t xml:space="preserve">12</w:t>
       </w:r>
       <w:r>
@@ -37,7 +31,25 @@
         <w:t xml:space="preserve"> </w:t>
       </w:r>
       <w:r>
-        <w:t xml:space="preserve">Proposal</w:t>
+        <w:t xml:space="preserve">for</w:t>
+      </w:r>
+      <w:r>
+        <w:t xml:space="preserve"> </w:t>
+      </w:r>
+      <w:r>
+        <w:t xml:space="preserve">National</w:t>
+      </w:r>
+      <w:r>
+        <w:t xml:space="preserve"> </w:t>
+      </w:r>
+      <w:r>
+        <w:t xml:space="preserve">Energy</w:t>
+      </w:r>
+      <w:r>
+        <w:t xml:space="preserve"> </w:t>
+      </w:r>
+      <w:r>
+        <w:t xml:space="preserve">Sovereignty</w:t>
       </w:r>
     </w:p>
     <w:p>
@@ -45,55 +57,61 @@
         <w:pStyle w:val="Subtitle"/>
       </w:pPr>
       <w:r>
-        <w:t xml:space="preserve">A</w:t>
-      </w:r>
-      <w:r>
-        <w:t xml:space="preserve"> </w:t>
-      </w:r>
-      <w:r>
-        <w:t xml:space="preserve">Technical</w:t>
-      </w:r>
-      <w:r>
-        <w:t xml:space="preserve"> </w:t>
-      </w:r>
-      <w:r>
-        <w:t xml:space="preserve">and</w:t>
-      </w:r>
-      <w:r>
-        <w:t xml:space="preserve"> </w:t>
-      </w:r>
-      <w:r>
-        <w:t xml:space="preserve">Policy</w:t>
-      </w:r>
-      <w:r>
-        <w:t xml:space="preserve"> </w:t>
-      </w:r>
-      <w:r>
-        <w:t xml:space="preserve">Framework</w:t>
-      </w:r>
-      <w:r>
-        <w:t xml:space="preserve"> </w:t>
-      </w:r>
-      <w:r>
-        <w:t xml:space="preserve">for</w:t>
-      </w:r>
-      <w:r>
-        <w:t xml:space="preserve"> </w:t>
-      </w:r>
-      <w:r>
-        <w:t xml:space="preserve">Next-Generation</w:t>
-      </w:r>
-      <w:r>
-        <w:t xml:space="preserve"> </w:t>
-      </w:r>
-      <w:r>
-        <w:t xml:space="preserve">Electrical</w:t>
-      </w:r>
-      <w:r>
-        <w:t xml:space="preserve"> </w:t>
-      </w:r>
-      <w:r>
-        <w:t xml:space="preserve">Infrastructure</w:t>
+        <w:t xml:space="preserve">Commodity-Steel</w:t>
+      </w:r>
+      <w:r>
+        <w:t xml:space="preserve"> </w:t>
+      </w:r>
+      <w:r>
+        <w:t xml:space="preserve">Transformers:</w:t>
+      </w:r>
+      <w:r>
+        <w:t xml:space="preserve"> </w:t>
+      </w:r>
+      <w:r>
+        <w:t xml:space="preserve">the</w:t>
+      </w:r>
+      <w:r>
+        <w:t xml:space="preserve"> </w:t>
+      </w:r>
+      <w:r>
+        <w:t xml:space="preserve">price</w:t>
+      </w:r>
+      <w:r>
+        <w:t xml:space="preserve"> </w:t>
+      </w:r>
+      <w:r>
+        <w:t xml:space="preserve">is</w:t>
+      </w:r>
+      <w:r>
+        <w:t xml:space="preserve"> </w:t>
+      </w:r>
+      <w:r>
+        <w:t xml:space="preserve">right,</w:t>
+      </w:r>
+      <w:r>
+        <w:t xml:space="preserve"> </w:t>
+      </w:r>
+      <w:r>
+        <w:t xml:space="preserve">the</w:t>
+      </w:r>
+      <w:r>
+        <w:t xml:space="preserve"> </w:t>
+      </w:r>
+      <w:r>
+        <w:t xml:space="preserve">time</w:t>
+      </w:r>
+      <w:r>
+        <w:t xml:space="preserve"> </w:t>
+      </w:r>
+      <w:r>
+        <w:t xml:space="preserve">is</w:t>
+      </w:r>
+      <w:r>
+        <w:t xml:space="preserve"> </w:t>
+      </w:r>
+      <w:r>
+        <w:t xml:space="preserve">right</w:t>
       </w:r>
     </w:p>
     <w:p>
@@ -115,6 +133,12 @@
         <w:pStyle w:val="Date"/>
       </w:pPr>
       <w:r>
+        <w:t xml:space="preserve">March</w:t>
+      </w:r>
+      <w:r>
+        <w:t xml:space="preserve"> </w:t>
+      </w:r>
+      <w:r>
         <w:t xml:space="preserve">2026</w:t>
       </w:r>
     </w:p>
@@ -131,7 +155,547 @@
         <w:pStyle w:val="Abstract"/>
       </w:pPr>
       <w:r>
-        <w:t xml:space="preserve">[Replace</w:t>
+        <w:t xml:space="preserve">There</w:t>
+      </w:r>
+      <w:r>
+        <w:t xml:space="preserve"> </w:t>
+      </w:r>
+      <w:r>
+        <w:t xml:space="preserve">is</w:t>
+      </w:r>
+      <w:r>
+        <w:t xml:space="preserve"> </w:t>
+      </w:r>
+      <w:r>
+        <w:t xml:space="preserve">no</w:t>
+      </w:r>
+      <w:r>
+        <w:t xml:space="preserve"> </w:t>
+      </w:r>
+      <w:r>
+        <w:t xml:space="preserve">strategic</w:t>
+      </w:r>
+      <w:r>
+        <w:t xml:space="preserve"> </w:t>
+      </w:r>
+      <w:r>
+        <w:t xml:space="preserve">reserve</w:t>
+      </w:r>
+      <w:r>
+        <w:t xml:space="preserve"> </w:t>
+      </w:r>
+      <w:r>
+        <w:t xml:space="preserve">for</w:t>
+      </w:r>
+      <w:r>
+        <w:t xml:space="preserve"> </w:t>
+      </w:r>
+      <w:r>
+        <w:t xml:space="preserve">the</w:t>
+      </w:r>
+      <w:r>
+        <w:t xml:space="preserve"> </w:t>
+      </w:r>
+      <w:r>
+        <w:t xml:space="preserve">large</w:t>
+      </w:r>
+      <w:r>
+        <w:t xml:space="preserve"> </w:t>
+      </w:r>
+      <w:r>
+        <w:t xml:space="preserve">power</w:t>
+      </w:r>
+      <w:r>
+        <w:t xml:space="preserve"> </w:t>
+      </w:r>
+      <w:r>
+        <w:t xml:space="preserve">transformer.</w:t>
+      </w:r>
+      <w:r>
+        <w:t xml:space="preserve"> </w:t>
+      </w:r>
+      <w:r>
+        <w:t xml:space="preserve">When</w:t>
+      </w:r>
+      <w:r>
+        <w:t xml:space="preserve"> </w:t>
+      </w:r>
+      <w:r>
+        <w:t xml:space="preserve">one</w:t>
+      </w:r>
+      <w:r>
+        <w:t xml:space="preserve"> </w:t>
+      </w:r>
+      <w:r>
+        <w:t xml:space="preserve">fails,</w:t>
+      </w:r>
+      <w:r>
+        <w:t xml:space="preserve"> </w:t>
+      </w:r>
+      <w:r>
+        <w:t xml:space="preserve">the</w:t>
+      </w:r>
+      <w:r>
+        <w:t xml:space="preserve"> </w:t>
+      </w:r>
+      <w:r>
+        <w:t xml:space="preserve">region</w:t>
+      </w:r>
+      <w:r>
+        <w:t xml:space="preserve"> </w:t>
+      </w:r>
+      <w:r>
+        <w:t xml:space="preserve">it</w:t>
+      </w:r>
+      <w:r>
+        <w:t xml:space="preserve"> </w:t>
+      </w:r>
+      <w:r>
+        <w:t xml:space="preserve">serves</w:t>
+      </w:r>
+      <w:r>
+        <w:t xml:space="preserve"> </w:t>
+      </w:r>
+      <w:r>
+        <w:t xml:space="preserve">goes</w:t>
+      </w:r>
+      <w:r>
+        <w:t xml:space="preserve"> </w:t>
+      </w:r>
+      <w:r>
+        <w:t xml:space="preserve">dark</w:t>
+      </w:r>
+      <w:r>
+        <w:t xml:space="preserve"> </w:t>
+      </w:r>
+      <w:r>
+        <w:t xml:space="preserve">for</w:t>
+      </w:r>
+      <w:r>
+        <w:t xml:space="preserve"> </w:t>
+      </w:r>
+      <w:r>
+        <w:t xml:space="preserve">years,</w:t>
+      </w:r>
+      <w:r>
+        <w:t xml:space="preserve"> </w:t>
+      </w:r>
+      <w:r>
+        <w:t xml:space="preserve">not</w:t>
+      </w:r>
+      <w:r>
+        <w:t xml:space="preserve"> </w:t>
+      </w:r>
+      <w:r>
+        <w:t xml:space="preserve">days,</w:t>
+      </w:r>
+      <w:r>
+        <w:t xml:space="preserve"> </w:t>
+      </w:r>
+      <w:r>
+        <w:t xml:space="preserve">because</w:t>
+      </w:r>
+      <w:r>
+        <w:t xml:space="preserve"> </w:t>
+      </w:r>
+      <w:r>
+        <w:t xml:space="preserve">every</w:t>
+      </w:r>
+      <w:r>
+        <w:t xml:space="preserve"> </w:t>
+      </w:r>
+      <w:r>
+        <w:t xml:space="preserve">replacement</w:t>
+      </w:r>
+      <w:r>
+        <w:t xml:space="preserve"> </w:t>
+      </w:r>
+      <w:r>
+        <w:t xml:space="preserve">requires</w:t>
+      </w:r>
+      <w:r>
+        <w:t xml:space="preserve"> </w:t>
+      </w:r>
+      <w:r>
+        <w:t xml:space="preserve">grain-oriented</w:t>
+      </w:r>
+      <w:r>
+        <w:t xml:space="preserve"> </w:t>
+      </w:r>
+      <w:r>
+        <w:t xml:space="preserve">electrical</w:t>
+      </w:r>
+      <w:r>
+        <w:t xml:space="preserve"> </w:t>
+      </w:r>
+      <w:r>
+        <w:t xml:space="preserve">steel,</w:t>
+      </w:r>
+      <w:r>
+        <w:t xml:space="preserve"> </w:t>
+      </w:r>
+      <w:r>
+        <w:t xml:space="preserve">a</w:t>
+      </w:r>
+      <w:r>
+        <w:t xml:space="preserve"> </w:t>
+      </w:r>
+      <w:r>
+        <w:t xml:space="preserve">specialty</w:t>
+      </w:r>
+      <w:r>
+        <w:t xml:space="preserve"> </w:t>
+      </w:r>
+      <w:r>
+        <w:t xml:space="preserve">alloy</w:t>
+      </w:r>
+      <w:r>
+        <w:t xml:space="preserve"> </w:t>
+      </w:r>
+      <w:r>
+        <w:t xml:space="preserve">produced</w:t>
+      </w:r>
+      <w:r>
+        <w:t xml:space="preserve"> </w:t>
+      </w:r>
+      <w:r>
+        <w:t xml:space="preserve">at</w:t>
+      </w:r>
+      <w:r>
+        <w:t xml:space="preserve"> </w:t>
+      </w:r>
+      <w:r>
+        <w:t xml:space="preserve">thirteen</w:t>
+      </w:r>
+      <w:r>
+        <w:t xml:space="preserve"> </w:t>
+      </w:r>
+      <w:r>
+        <w:t xml:space="preserve">facilities</w:t>
+      </w:r>
+      <w:r>
+        <w:t xml:space="preserve"> </w:t>
+      </w:r>
+      <w:r>
+        <w:t xml:space="preserve">worldwide,</w:t>
+      </w:r>
+      <w:r>
+        <w:t xml:space="preserve"> </w:t>
+      </w:r>
+      <w:r>
+        <w:t xml:space="preserve">concentrated</w:t>
+      </w:r>
+      <w:r>
+        <w:t xml:space="preserve"> </w:t>
+      </w:r>
+      <w:r>
+        <w:t xml:space="preserve">in</w:t>
+      </w:r>
+      <w:r>
+        <w:t xml:space="preserve"> </w:t>
+      </w:r>
+      <w:r>
+        <w:t xml:space="preserve">China,</w:t>
+      </w:r>
+      <w:r>
+        <w:t xml:space="preserve"> </w:t>
+      </w:r>
+      <w:r>
+        <w:t xml:space="preserve">Japan,</w:t>
+      </w:r>
+      <w:r>
+        <w:t xml:space="preserve"> </w:t>
+      </w:r>
+      <w:r>
+        <w:t xml:space="preserve">South</w:t>
+      </w:r>
+      <w:r>
+        <w:t xml:space="preserve"> </w:t>
+      </w:r>
+      <w:r>
+        <w:t xml:space="preserve">Korea,</w:t>
+      </w:r>
+      <w:r>
+        <w:t xml:space="preserve"> </w:t>
+      </w:r>
+      <w:r>
+        <w:t xml:space="preserve">and</w:t>
+      </w:r>
+      <w:r>
+        <w:t xml:space="preserve"> </w:t>
+      </w:r>
+      <w:r>
+        <w:t xml:space="preserve">Russia.</w:t>
+      </w:r>
+      <w:r>
+        <w:t xml:space="preserve"> </w:t>
+      </w:r>
+      <w:r>
+        <w:t xml:space="preserve">Lead</w:t>
+      </w:r>
+      <w:r>
+        <w:t xml:space="preserve"> </w:t>
+      </w:r>
+      <w:r>
+        <w:t xml:space="preserve">times</w:t>
+      </w:r>
+      <w:r>
+        <w:t xml:space="preserve"> </w:t>
+      </w:r>
+      <w:r>
+        <w:t xml:space="preserve">run</w:t>
+      </w:r>
+      <w:r>
+        <w:t xml:space="preserve"> </w:t>
+      </w:r>
+      <w:r>
+        <w:t xml:space="preserve">2.5</w:t>
+      </w:r>
+      <w:r>
+        <w:t xml:space="preserve"> </w:t>
+      </w:r>
+      <w:r>
+        <w:t xml:space="preserve">to</w:t>
+      </w:r>
+      <w:r>
+        <w:t xml:space="preserve"> </w:t>
+      </w:r>
+      <w:r>
+        <w:t xml:space="preserve">2.8</w:t>
+      </w:r>
+      <w:r>
+        <w:t xml:space="preserve"> </w:t>
+      </w:r>
+      <w:r>
+        <w:t xml:space="preserve">years.</w:t>
+      </w:r>
+      <w:r>
+        <w:t xml:space="preserve"> </w:t>
+      </w:r>
+      <w:r>
+        <w:t xml:space="preserve">The</w:t>
+      </w:r>
+      <w:r>
+        <w:t xml:space="preserve"> </w:t>
+      </w:r>
+      <w:r>
+        <w:t xml:space="preserve">United</w:t>
+      </w:r>
+      <w:r>
+        <w:t xml:space="preserve"> </w:t>
+      </w:r>
+      <w:r>
+        <w:t xml:space="preserve">States</w:t>
+      </w:r>
+      <w:r>
+        <w:t xml:space="preserve"> </w:t>
+      </w:r>
+      <w:r>
+        <w:t xml:space="preserve">imports</w:t>
+      </w:r>
+      <w:r>
+        <w:t xml:space="preserve"> </w:t>
+      </w:r>
+      <w:r>
+        <w:t xml:space="preserve">80</w:t>
+      </w:r>
+      <w:r>
+        <w:t xml:space="preserve"> </w:t>
+      </w:r>
+      <w:r>
+        <w:t xml:space="preserve">percent</w:t>
+      </w:r>
+      <w:r>
+        <w:t xml:space="preserve"> </w:t>
+      </w:r>
+      <w:r>
+        <w:t xml:space="preserve">of</w:t>
+      </w:r>
+      <w:r>
+        <w:t xml:space="preserve"> </w:t>
+      </w:r>
+      <w:r>
+        <w:t xml:space="preserve">its</w:t>
+      </w:r>
+      <w:r>
+        <w:t xml:space="preserve"> </w:t>
+      </w:r>
+      <w:r>
+        <w:t xml:space="preserve">power</w:t>
+      </w:r>
+      <w:r>
+        <w:t xml:space="preserve"> </w:t>
+      </w:r>
+      <w:r>
+        <w:t xml:space="preserve">transformers.</w:t>
+      </w:r>
+      <w:r>
+        <w:t xml:space="preserve"> </w:t>
+      </w:r>
+      <w:r>
+        <w:t xml:space="preserve">Data</w:t>
+      </w:r>
+      <w:r>
+        <w:t xml:space="preserve"> </w:t>
+      </w:r>
+      <w:r>
+        <w:t xml:space="preserve">centers</w:t>
+      </w:r>
+      <w:r>
+        <w:t xml:space="preserve"> </w:t>
+      </w:r>
+      <w:r>
+        <w:t xml:space="preserve">for</w:t>
+      </w:r>
+      <w:r>
+        <w:t xml:space="preserve"> </w:t>
+      </w:r>
+      <w:r>
+        <w:t xml:space="preserve">AI,</w:t>
+      </w:r>
+      <w:r>
+        <w:t xml:space="preserve"> </w:t>
+      </w:r>
+      <w:r>
+        <w:t xml:space="preserve">factories</w:t>
+      </w:r>
+      <w:r>
+        <w:t xml:space="preserve"> </w:t>
+      </w:r>
+      <w:r>
+        <w:t xml:space="preserve">returning</w:t>
+      </w:r>
+      <w:r>
+        <w:t xml:space="preserve"> </w:t>
+      </w:r>
+      <w:r>
+        <w:t xml:space="preserve">from</w:t>
+      </w:r>
+      <w:r>
+        <w:t xml:space="preserve"> </w:t>
+      </w:r>
+      <w:r>
+        <w:t xml:space="preserve">Asia,</w:t>
+      </w:r>
+      <w:r>
+        <w:t xml:space="preserve"> </w:t>
+      </w:r>
+      <w:r>
+        <w:t xml:space="preserve">new</w:t>
+      </w:r>
+      <w:r>
+        <w:t xml:space="preserve"> </w:t>
+      </w:r>
+      <w:r>
+        <w:t xml:space="preserve">generation</w:t>
+      </w:r>
+      <w:r>
+        <w:t xml:space="preserve"> </w:t>
+      </w:r>
+      <w:r>
+        <w:t xml:space="preserve">of</w:t>
+      </w:r>
+      <w:r>
+        <w:t xml:space="preserve"> </w:t>
+      </w:r>
+      <w:r>
+        <w:t xml:space="preserve">every</w:t>
+      </w:r>
+      <w:r>
+        <w:t xml:space="preserve"> </w:t>
+      </w:r>
+      <w:r>
+        <w:t xml:space="preserve">kind:</w:t>
+      </w:r>
+      <w:r>
+        <w:t xml:space="preserve"> </w:t>
+      </w:r>
+      <w:r>
+        <w:t xml:space="preserve">all</w:t>
+      </w:r>
+      <w:r>
+        <w:t xml:space="preserve"> </w:t>
+      </w:r>
+      <w:r>
+        <w:t xml:space="preserve">waiting</w:t>
+      </w:r>
+      <w:r>
+        <w:t xml:space="preserve"> </w:t>
+      </w:r>
+      <w:r>
+        <w:t xml:space="preserve">in</w:t>
+      </w:r>
+      <w:r>
+        <w:t xml:space="preserve"> </w:t>
+      </w:r>
+      <w:r>
+        <w:t xml:space="preserve">a</w:t>
+      </w:r>
+      <w:r>
+        <w:t xml:space="preserve"> </w:t>
+      </w:r>
+      <w:r>
+        <w:t xml:space="preserve">procurement</w:t>
+      </w:r>
+      <w:r>
+        <w:t xml:space="preserve"> </w:t>
+      </w:r>
+      <w:r>
+        <w:t xml:space="preserve">queue</w:t>
+      </w:r>
+      <w:r>
+        <w:t xml:space="preserve"> </w:t>
+      </w:r>
+      <w:r>
+        <w:t xml:space="preserve">no</w:t>
+      </w:r>
+      <w:r>
+        <w:t xml:space="preserve"> </w:t>
+      </w:r>
+      <w:r>
+        <w:t xml:space="preserve">country</w:t>
+      </w:r>
+      <w:r>
+        <w:t xml:space="preserve"> </w:t>
+      </w:r>
+      <w:r>
+        <w:t xml:space="preserve">can</w:t>
+      </w:r>
+      <w:r>
+        <w:t xml:space="preserve"> </w:t>
+      </w:r>
+      <w:r>
+        <w:t xml:space="preserve">jump.</w:t>
+      </w:r>
+      <w:r>
+        <w:t xml:space="preserve"> </w:t>
+      </w:r>
+      <w:r>
+        <w:t xml:space="preserve">The</w:t>
+      </w:r>
+      <w:r>
+        <w:t xml:space="preserve"> </w:t>
+      </w:r>
+      <w:r>
+        <w:t xml:space="preserve">Department</w:t>
+      </w:r>
+      <w:r>
+        <w:t xml:space="preserve"> </w:t>
+      </w:r>
+      <w:r>
+        <w:t xml:space="preserve">of</w:t>
+      </w:r>
+      <w:r>
+        <w:t xml:space="preserve"> </w:t>
+      </w:r>
+      <w:r>
+        <w:t xml:space="preserve">Energy</w:t>
+      </w:r>
+      <w:r>
+        <w:t xml:space="preserve"> </w:t>
+      </w:r>
+      <w:r>
+        <w:t xml:space="preserve">named</w:t>
       </w:r>
       <w:r>
         <w:t xml:space="preserve"> </w:t>
@@ -143,49 +707,701 @@
         <w:t xml:space="preserve"> </w:t>
       </w:r>
       <w:r>
+        <w:t xml:space="preserve">the</w:t>
+      </w:r>
+      <w:r>
+        <w:t xml:space="preserve"> </w:t>
+      </w:r>
+      <w:r>
+        <w:t xml:space="preserve">single</w:t>
+      </w:r>
+      <w:r>
+        <w:t xml:space="preserve"> </w:t>
+      </w:r>
+      <w:r>
+        <w:t xml:space="preserve">most</w:t>
+      </w:r>
+      <w:r>
+        <w:t xml:space="preserve"> </w:t>
+      </w:r>
+      <w:r>
+        <w:t xml:space="preserve">critical</w:t>
+      </w:r>
+      <w:r>
+        <w:t xml:space="preserve"> </w:t>
+      </w:r>
+      <w:r>
+        <w:t xml:space="preserve">vulnerability</w:t>
+      </w:r>
+      <w:r>
+        <w:t xml:space="preserve"> </w:t>
+      </w:r>
+      <w:r>
+        <w:t xml:space="preserve">in</w:t>
+      </w:r>
+      <w:r>
+        <w:t xml:space="preserve"> </w:t>
+      </w:r>
+      <w:r>
+        <w:t xml:space="preserve">national</w:t>
+      </w:r>
+      <w:r>
+        <w:t xml:space="preserve"> </w:t>
+      </w:r>
+      <w:r>
+        <w:t xml:space="preserve">grid</w:t>
+      </w:r>
+      <w:r>
+        <w:t xml:space="preserve"> </w:t>
+      </w:r>
+      <w:r>
+        <w:t xml:space="preserve">infrastructure.</w:t>
+      </w:r>
+      <w:r>
+        <w:t xml:space="preserve"> </w:t>
+      </w:r>
+      <w:r>
+        <w:t xml:space="preserve">The</w:t>
+      </w:r>
+      <w:r>
+        <w:t xml:space="preserve"> </w:t>
+      </w:r>
+      <w:r>
+        <w:t xml:space="preserve">shortage</w:t>
+      </w:r>
+      <w:r>
+        <w:t xml:space="preserve"> </w:t>
+      </w:r>
+      <w:r>
+        <w:t xml:space="preserve">is</w:t>
+      </w:r>
+      <w:r>
+        <w:t xml:space="preserve"> </w:t>
+      </w:r>
+      <w:r>
+        <w:t xml:space="preserve">structural,</w:t>
+      </w:r>
+      <w:r>
+        <w:t xml:space="preserve"> </w:t>
+      </w:r>
+      <w:r>
+        <w:t xml:space="preserve">not</w:t>
+      </w:r>
+      <w:r>
+        <w:t xml:space="preserve"> </w:t>
+      </w:r>
+      <w:r>
+        <w:t xml:space="preserve">cyclical.</w:t>
+      </w:r>
+    </w:p>
+    <w:p>
+      <w:pPr>
+        <w:pStyle w:val="Abstract"/>
+      </w:pPr>
+      <w:r>
+        <w:t xml:space="preserve">The</w:t>
+      </w:r>
+      <w:r>
+        <w:t xml:space="preserve"> </w:t>
+      </w:r>
+      <w:r>
+        <w:t xml:space="preserve">solution</w:t>
+      </w:r>
+      <w:r>
+        <w:t xml:space="preserve"> </w:t>
+      </w:r>
+      <w:r>
+        <w:t xml:space="preserve">has</w:t>
+      </w:r>
+      <w:r>
+        <w:t xml:space="preserve"> </w:t>
+      </w:r>
+      <w:r>
+        <w:t xml:space="preserve">been</w:t>
+      </w:r>
+      <w:r>
+        <w:t xml:space="preserve"> </w:t>
+      </w:r>
+      <w:r>
+        <w:t xml:space="preserve">running</w:t>
+      </w:r>
+      <w:r>
+        <w:t xml:space="preserve"> </w:t>
+      </w:r>
+      <w:r>
+        <w:t xml:space="preserve">for</w:t>
+      </w:r>
+      <w:r>
+        <w:t xml:space="preserve"> </w:t>
+      </w:r>
+      <w:r>
+        <w:t xml:space="preserve">over</w:t>
+      </w:r>
+      <w:r>
+        <w:t xml:space="preserve"> </w:t>
+      </w:r>
+      <w:r>
+        <w:t xml:space="preserve">a</w:t>
+      </w:r>
+      <w:r>
+        <w:t xml:space="preserve"> </w:t>
+      </w:r>
+      <w:r>
+        <w:t xml:space="preserve">century.</w:t>
+      </w:r>
+      <w:r>
+        <w:t xml:space="preserve"> </w:t>
+      </w:r>
+      <w:r>
+        <w:t xml:space="preserve">Germany’s</w:t>
+      </w:r>
+      <w:r>
+        <w:t xml:space="preserve"> </w:t>
+      </w:r>
+      <w:r>
+        <w:t xml:space="preserve">Bahnstrom</w:t>
+      </w:r>
+      <w:r>
+        <w:t xml:space="preserve"> </w:t>
+      </w:r>
+      <w:r>
+        <w:t xml:space="preserve">railway</w:t>
+      </w:r>
+      <w:r>
+        <w:t xml:space="preserve"> </w:t>
+      </w:r>
+      <w:r>
+        <w:t xml:space="preserve">power</w:t>
+      </w:r>
+      <w:r>
+        <w:t xml:space="preserve"> </w:t>
+      </w:r>
+      <w:r>
+        <w:t xml:space="preserve">grid,</w:t>
+      </w:r>
+      <w:r>
+        <w:t xml:space="preserve"> </w:t>
+      </w:r>
+      <w:r>
+        <w:t xml:space="preserve">built</w:t>
+      </w:r>
+      <w:r>
+        <w:t xml:space="preserve"> </w:t>
+      </w:r>
+      <w:r>
+        <w:t xml:space="preserve">in</w:t>
+      </w:r>
+      <w:r>
+        <w:t xml:space="preserve"> </w:t>
+      </w:r>
+      <w:r>
+        <w:t xml:space="preserve">1912</w:t>
+      </w:r>
+      <w:r>
+        <w:t xml:space="preserve"> </w:t>
+      </w:r>
+      <w:r>
+        <w:t xml:space="preserve">at</w:t>
+      </w:r>
+      <w:r>
+        <w:t xml:space="preserve"> </w:t>
+      </w:r>
+      <w:r>
+        <w:t xml:space="preserve">16.7</w:t>
+      </w:r>
+      <w:r>
+        <w:t xml:space="preserve"> </w:t>
+      </w:r>
+      <w:r>
+        <w:t xml:space="preserve">Hz,</w:t>
+      </w:r>
+      <w:r>
+        <w:t xml:space="preserve"> </w:t>
+      </w:r>
+      <w:r>
+        <w:t xml:space="preserve">uses</w:t>
+      </w:r>
+      <w:r>
+        <w:t xml:space="preserve"> </w:t>
+      </w:r>
+      <w:r>
+        <w:t xml:space="preserve">transformers</w:t>
+      </w:r>
+      <w:r>
+        <w:t xml:space="preserve"> </w:t>
+      </w:r>
+      <w:r>
+        <w:t xml:space="preserve">wound</w:t>
+      </w:r>
+      <w:r>
+        <w:t xml:space="preserve"> </w:t>
+      </w:r>
+      <w:r>
+        <w:t xml:space="preserve">from</w:t>
+      </w:r>
+      <w:r>
+        <w:t xml:space="preserve"> </w:t>
+      </w:r>
+      <w:r>
+        <w:t xml:space="preserve">ordinary</w:t>
+      </w:r>
+      <w:r>
+        <w:t xml:space="preserve"> </w:t>
+      </w:r>
+      <w:r>
+        <w:t xml:space="preserve">mild</w:t>
+      </w:r>
+      <w:r>
+        <w:t xml:space="preserve"> </w:t>
+      </w:r>
+      <w:r>
+        <w:t xml:space="preserve">steel,</w:t>
+      </w:r>
+      <w:r>
+        <w:t xml:space="preserve"> </w:t>
+      </w:r>
+      <w:r>
         <w:t xml:space="preserve">with</w:t>
       </w:r>
       <w:r>
         <w:t xml:space="preserve"> </w:t>
       </w:r>
       <w:r>
-        <w:t xml:space="preserve">your</w:t>
-      </w:r>
-      <w:r>
-        <w:t xml:space="preserve"> </w:t>
-      </w:r>
-      <w:r>
-        <w:t xml:space="preserve">executive</w:t>
-      </w:r>
-      <w:r>
-        <w:t xml:space="preserve"> </w:t>
-      </w:r>
-      <w:r>
-        <w:t xml:space="preserve">summary.</w:t>
-      </w:r>
-      <w:r>
-        <w:t xml:space="preserve"> </w:t>
-      </w:r>
-      <w:r>
-        <w:t xml:space="preserve">This</w:t>
-      </w:r>
-      <w:r>
-        <w:t xml:space="preserve"> </w:t>
-      </w:r>
-      <w:r>
-        <w:t xml:space="preserve">placeholder</w:t>
-      </w:r>
-      <w:r>
-        <w:t xml:space="preserve"> </w:t>
-      </w:r>
-      <w:r>
-        <w:t xml:space="preserve">will</w:t>
-      </w:r>
-      <w:r>
-        <w:t xml:space="preserve"> </w:t>
-      </w:r>
-      <w:r>
-        <w:t xml:space="preserve">appear</w:t>
+        <w:t xml:space="preserve">no</w:t>
+      </w:r>
+      <w:r>
+        <w:t xml:space="preserve"> </w:t>
+      </w:r>
+      <w:r>
+        <w:t xml:space="preserve">specialty</w:t>
+      </w:r>
+      <w:r>
+        <w:t xml:space="preserve"> </w:t>
+      </w:r>
+      <w:r>
+        <w:t xml:space="preserve">alloy</w:t>
+      </w:r>
+      <w:r>
+        <w:t xml:space="preserve"> </w:t>
+      </w:r>
+      <w:r>
+        <w:t xml:space="preserve">required.</w:t>
+      </w:r>
+      <w:r>
+        <w:t xml:space="preserve"> </w:t>
+      </w:r>
+      <w:r>
+        <w:t xml:space="preserve">That</w:t>
+      </w:r>
+      <w:r>
+        <w:t xml:space="preserve"> </w:t>
+      </w:r>
+      <w:r>
+        <w:t xml:space="preserve">grid</w:t>
+      </w:r>
+      <w:r>
+        <w:t xml:space="preserve"> </w:t>
+      </w:r>
+      <w:r>
+        <w:t xml:space="preserve">still</w:t>
+      </w:r>
+      <w:r>
+        <w:t xml:space="preserve"> </w:t>
+      </w:r>
+      <w:r>
+        <w:t xml:space="preserve">runs</w:t>
+      </w:r>
+      <w:r>
+        <w:t xml:space="preserve"> </w:t>
+      </w:r>
+      <w:r>
+        <w:t xml:space="preserve">today,</w:t>
+      </w:r>
+      <w:r>
+        <w:t xml:space="preserve"> </w:t>
+      </w:r>
+      <w:r>
+        <w:t xml:space="preserve">unchanged</w:t>
+      </w:r>
+      <w:r>
+        <w:t xml:space="preserve"> </w:t>
+      </w:r>
+      <w:r>
+        <w:t xml:space="preserve">in</w:t>
+      </w:r>
+      <w:r>
+        <w:t xml:space="preserve"> </w:t>
+      </w:r>
+      <w:r>
+        <w:t xml:space="preserve">principle,</w:t>
+      </w:r>
+      <w:r>
+        <w:t xml:space="preserve"> </w:t>
+      </w:r>
+      <w:r>
+        <w:t xml:space="preserve">across</w:t>
+      </w:r>
+      <w:r>
+        <w:t xml:space="preserve"> </w:t>
+      </w:r>
+      <w:r>
+        <w:t xml:space="preserve">five</w:t>
+      </w:r>
+      <w:r>
+        <w:t xml:space="preserve"> </w:t>
+      </w:r>
+      <w:r>
+        <w:t xml:space="preserve">countries.</w:t>
+      </w:r>
+      <w:r>
+        <w:t xml:space="preserve"> </w:t>
+      </w:r>
+      <w:r>
+        <w:t xml:space="preserve">At</w:t>
+      </w:r>
+      <w:r>
+        <w:t xml:space="preserve"> </w:t>
+      </w:r>
+      <w:r>
+        <w:t xml:space="preserve">12</w:t>
+      </w:r>
+      <w:r>
+        <w:t xml:space="preserve"> </w:t>
+      </w:r>
+      <w:r>
+        <w:t xml:space="preserve">Hz,</w:t>
+      </w:r>
+      <w:r>
+        <w:t xml:space="preserve"> </w:t>
+      </w:r>
+      <w:r>
+        <w:t xml:space="preserve">adapted</w:t>
+      </w:r>
+      <w:r>
+        <w:t xml:space="preserve"> </w:t>
+      </w:r>
+      <w:r>
+        <w:t xml:space="preserve">for</w:t>
+      </w:r>
+      <w:r>
+        <w:t xml:space="preserve"> </w:t>
+      </w:r>
+      <w:r>
+        <w:t xml:space="preserve">North</w:t>
+      </w:r>
+      <w:r>
+        <w:t xml:space="preserve"> </w:t>
+      </w:r>
+      <w:r>
+        <w:t xml:space="preserve">American</w:t>
+      </w:r>
+      <w:r>
+        <w:t xml:space="preserve"> </w:t>
+      </w:r>
+      <w:r>
+        <w:t xml:space="preserve">grids,</w:t>
+      </w:r>
+      <w:r>
+        <w:t xml:space="preserve"> </w:t>
+      </w:r>
+      <w:r>
+        <w:t xml:space="preserve">commodity</w:t>
+      </w:r>
+      <w:r>
+        <w:t xml:space="preserve"> </w:t>
+      </w:r>
+      <w:r>
+        <w:t xml:space="preserve">steel</w:t>
+      </w:r>
+      <w:r>
+        <w:t xml:space="preserve"> </w:t>
+      </w:r>
+      <w:r>
+        <w:t xml:space="preserve">works</w:t>
+      </w:r>
+      <w:r>
+        <w:t xml:space="preserve"> </w:t>
+      </w:r>
+      <w:r>
+        <w:t xml:space="preserve">with</w:t>
+      </w:r>
+      <w:r>
+        <w:t xml:space="preserve"> </w:t>
+      </w:r>
+      <w:r>
+        <w:t xml:space="preserve">greater</w:t>
+      </w:r>
+      <w:r>
+        <w:t xml:space="preserve"> </w:t>
+      </w:r>
+      <w:r>
+        <w:t xml:space="preserve">margin.</w:t>
+      </w:r>
+      <w:r>
+        <w:t xml:space="preserve"> </w:t>
+      </w:r>
+      <w:r>
+        <w:t xml:space="preserve">Any</w:t>
+      </w:r>
+      <w:r>
+        <w:t xml:space="preserve"> </w:t>
+      </w:r>
+      <w:r>
+        <w:t xml:space="preserve">steel</w:t>
+      </w:r>
+      <w:r>
+        <w:t xml:space="preserve"> </w:t>
+      </w:r>
+      <w:r>
+        <w:t xml:space="preserve">mill</w:t>
+      </w:r>
+      <w:r>
+        <w:t xml:space="preserve"> </w:t>
+      </w:r>
+      <w:r>
+        <w:t xml:space="preserve">can</w:t>
+      </w:r>
+      <w:r>
+        <w:t xml:space="preserve"> </w:t>
+      </w:r>
+      <w:r>
+        <w:t xml:space="preserve">supply</w:t>
+      </w:r>
+      <w:r>
+        <w:t xml:space="preserve"> </w:t>
+      </w:r>
+      <w:r>
+        <w:t xml:space="preserve">the</w:t>
+      </w:r>
+      <w:r>
+        <w:t xml:space="preserve"> </w:t>
+      </w:r>
+      <w:r>
+        <w:t xml:space="preserve">cores.</w:t>
+      </w:r>
+      <w:r>
+        <w:t xml:space="preserve"> </w:t>
+      </w:r>
+      <w:r>
+        <w:t xml:space="preserve">A</w:t>
+      </w:r>
+      <w:r>
+        <w:t xml:space="preserve"> </w:t>
+      </w:r>
+      <w:r>
+        <w:t xml:space="preserve">transformer</w:t>
+      </w:r>
+      <w:r>
+        <w:t xml:space="preserve"> </w:t>
+      </w:r>
+      <w:r>
+        <w:t xml:space="preserve">factory</w:t>
+      </w:r>
+      <w:r>
+        <w:t xml:space="preserve"> </w:t>
+      </w:r>
+      <w:r>
+        <w:t xml:space="preserve">commissions</w:t>
+      </w:r>
+      <w:r>
+        <w:t xml:space="preserve"> </w:t>
+      </w:r>
+      <w:r>
+        <w:t xml:space="preserve">in</w:t>
+      </w:r>
+      <w:r>
+        <w:t xml:space="preserve"> </w:t>
+      </w:r>
+      <w:r>
+        <w:t xml:space="preserve">six</w:t>
+      </w:r>
+      <w:r>
+        <w:t xml:space="preserve"> </w:t>
+      </w:r>
+      <w:r>
+        <w:t xml:space="preserve">to</w:t>
+      </w:r>
+      <w:r>
+        <w:t xml:space="preserve"> </w:t>
+      </w:r>
+      <w:r>
+        <w:t xml:space="preserve">nine</w:t>
+      </w:r>
+      <w:r>
+        <w:t xml:space="preserve"> </w:t>
+      </w:r>
+      <w:r>
+        <w:t xml:space="preserve">months.</w:t>
+      </w:r>
+      <w:r>
+        <w:t xml:space="preserve"> </w:t>
+      </w:r>
+      <w:r>
+        <w:t xml:space="preserve">Units</w:t>
+      </w:r>
+      <w:r>
+        <w:t xml:space="preserve"> </w:t>
+      </w:r>
+      <w:r>
+        <w:t xml:space="preserve">arrive</w:t>
+      </w:r>
+      <w:r>
+        <w:t xml:space="preserve"> </w:t>
+      </w:r>
+      <w:r>
+        <w:t xml:space="preserve">by</w:t>
+      </w:r>
+      <w:r>
+        <w:t xml:space="preserve"> </w:t>
+      </w:r>
+      <w:r>
+        <w:t xml:space="preserve">standard</w:t>
+      </w:r>
+      <w:r>
+        <w:t xml:space="preserve"> </w:t>
+      </w:r>
+      <w:r>
+        <w:t xml:space="preserve">truck,</w:t>
+      </w:r>
+      <w:r>
+        <w:t xml:space="preserve"> </w:t>
+      </w:r>
+      <w:r>
+        <w:t xml:space="preserve">assemble</w:t>
+      </w:r>
+      <w:r>
+        <w:t xml:space="preserve"> </w:t>
+      </w:r>
+      <w:r>
+        <w:t xml:space="preserve">on-site,</w:t>
+      </w:r>
+      <w:r>
+        <w:t xml:space="preserve"> </w:t>
+      </w:r>
+      <w:r>
+        <w:t xml:space="preserve">and</w:t>
+      </w:r>
+      <w:r>
+        <w:t xml:space="preserve"> </w:t>
+      </w:r>
+      <w:r>
+        <w:t xml:space="preserve">are</w:t>
+      </w:r>
+      <w:r>
+        <w:t xml:space="preserve"> </w:t>
+      </w:r>
+      <w:r>
+        <w:t xml:space="preserve">repairable</w:t>
+      </w:r>
+      <w:r>
+        <w:t xml:space="preserve"> </w:t>
+      </w:r>
+      <w:r>
+        <w:t xml:space="preserve">from</w:t>
+      </w:r>
+      <w:r>
+        <w:t xml:space="preserve"> </w:t>
+      </w:r>
+      <w:r>
+        <w:t xml:space="preserve">materials</w:t>
+      </w:r>
+      <w:r>
+        <w:t xml:space="preserve"> </w:t>
+      </w:r>
+      <w:r>
+        <w:t xml:space="preserve">available</w:t>
+      </w:r>
+      <w:r>
+        <w:t xml:space="preserve"> </w:t>
+      </w:r>
+      <w:r>
+        <w:t xml:space="preserve">in</w:t>
+      </w:r>
+      <w:r>
+        <w:t xml:space="preserve"> </w:t>
+      </w:r>
+      <w:r>
+        <w:t xml:space="preserve">any</w:t>
+      </w:r>
+      <w:r>
+        <w:t xml:space="preserve"> </w:t>
+      </w:r>
+      <w:r>
+        <w:t xml:space="preserve">country.</w:t>
+      </w:r>
+    </w:p>
+    <w:p>
+      <w:pPr>
+        <w:pStyle w:val="Abstract"/>
+      </w:pPr>
+      <w:r>
+        <w:t xml:space="preserve">The</w:t>
+      </w:r>
+      <w:r>
+        <w:t xml:space="preserve"> </w:t>
+      </w:r>
+      <w:r>
+        <w:t xml:space="preserve">engineering</w:t>
+      </w:r>
+      <w:r>
+        <w:t xml:space="preserve"> </w:t>
+      </w:r>
+      <w:r>
+        <w:t xml:space="preserve">has</w:t>
+      </w:r>
+      <w:r>
+        <w:t xml:space="preserve"> </w:t>
+      </w:r>
+      <w:r>
+        <w:t xml:space="preserve">a</w:t>
+      </w:r>
+      <w:r>
+        <w:t xml:space="preserve"> </w:t>
+      </w:r>
+      <w:r>
+        <w:t xml:space="preserve">century</w:t>
+      </w:r>
+      <w:r>
+        <w:t xml:space="preserve"> </w:t>
+      </w:r>
+      <w:r>
+        <w:t xml:space="preserve">of</w:t>
+      </w:r>
+      <w:r>
+        <w:t xml:space="preserve"> </w:t>
+      </w:r>
+      <w:r>
+        <w:t xml:space="preserve">operational</w:t>
+      </w:r>
+      <w:r>
+        <w:t xml:space="preserve"> </w:t>
+      </w:r>
+      <w:r>
+        <w:t xml:space="preserve">proof.</w:t>
+      </w:r>
+      <w:r>
+        <w:t xml:space="preserve"> </w:t>
+      </w:r>
+      <w:r>
+        <w:t xml:space="preserve">Deployment</w:t>
+      </w:r>
+      <w:r>
+        <w:t xml:space="preserve"> </w:t>
+      </w:r>
+      <w:r>
+        <w:t xml:space="preserve">means</w:t>
+      </w:r>
+      <w:r>
+        <w:t xml:space="preserve"> </w:t>
+      </w:r>
+      <w:r>
+        <w:t xml:space="preserve">grid</w:t>
+      </w:r>
+      <w:r>
+        <w:t xml:space="preserve"> </w:t>
+      </w:r>
+      <w:r>
+        <w:t xml:space="preserve">expansion</w:t>
       </w:r>
       <w:r>
         <w:t xml:space="preserve"> </w:t>
@@ -197,25 +1413,223 @@
         <w:t xml:space="preserve"> </w:t>
       </w:r>
       <w:r>
+        <w:t xml:space="preserve">a</w:t>
+      </w:r>
+      <w:r>
+        <w:t xml:space="preserve"> </w:t>
+      </w:r>
+      <w:r>
+        <w:t xml:space="preserve">locally</w:t>
+      </w:r>
+      <w:r>
+        <w:t xml:space="preserve"> </w:t>
+      </w:r>
+      <w:r>
+        <w:t xml:space="preserve">controlled</w:t>
+      </w:r>
+      <w:r>
+        <w:t xml:space="preserve"> </w:t>
+      </w:r>
+      <w:r>
+        <w:t xml:space="preserve">timeline,</w:t>
+      </w:r>
+      <w:r>
+        <w:t xml:space="preserve"> </w:t>
+      </w:r>
+      <w:r>
+        <w:t xml:space="preserve">with</w:t>
+      </w:r>
+      <w:r>
+        <w:t xml:space="preserve"> </w:t>
+      </w:r>
+      <w:r>
+        <w:t xml:space="preserve">transformers</w:t>
+      </w:r>
+      <w:r>
+        <w:t xml:space="preserve"> </w:t>
+      </w:r>
+      <w:r>
+        <w:t xml:space="preserve">built</w:t>
+      </w:r>
+      <w:r>
+        <w:t xml:space="preserve"> </w:t>
+      </w:r>
+      <w:r>
+        <w:t xml:space="preserve">and</w:t>
+      </w:r>
+      <w:r>
+        <w:t xml:space="preserve"> </w:t>
+      </w:r>
+      <w:r>
+        <w:t xml:space="preserve">repaired</w:t>
+      </w:r>
+      <w:r>
+        <w:t xml:space="preserve"> </w:t>
+      </w:r>
+      <w:r>
+        <w:t xml:space="preserve">from</w:t>
+      </w:r>
+      <w:r>
+        <w:t xml:space="preserve"> </w:t>
+      </w:r>
+      <w:r>
+        <w:t xml:space="preserve">local</w:t>
+      </w:r>
+      <w:r>
+        <w:t xml:space="preserve"> </w:t>
+      </w:r>
+      <w:r>
+        <w:t xml:space="preserve">materials</w:t>
+      </w:r>
+      <w:r>
+        <w:t xml:space="preserve"> </w:t>
+      </w:r>
+      <w:r>
+        <w:t xml:space="preserve">by</w:t>
+      </w:r>
+      <w:r>
+        <w:t xml:space="preserve"> </w:t>
+      </w:r>
+      <w:r>
+        <w:t xml:space="preserve">local</w:t>
+      </w:r>
+      <w:r>
+        <w:t xml:space="preserve"> </w:t>
+      </w:r>
+      <w:r>
+        <w:t xml:space="preserve">workers.</w:t>
+      </w:r>
+      <w:r>
+        <w:t xml:space="preserve"> </w:t>
+      </w:r>
+      <w:r>
+        <w:t xml:space="preserve">The</w:t>
+      </w:r>
+      <w:r>
+        <w:t xml:space="preserve"> </w:t>
+      </w:r>
+      <w:r>
+        <w:t xml:space="preserve">12</w:t>
+      </w:r>
+      <w:r>
+        <w:t xml:space="preserve"> </w:t>
+      </w:r>
+      <w:r>
+        <w:t xml:space="preserve">Hz</w:t>
+      </w:r>
+      <w:r>
+        <w:t xml:space="preserve"> </w:t>
+      </w:r>
+      <w:r>
+        <w:t xml:space="preserve">frequency</w:t>
+      </w:r>
+      <w:r>
+        <w:t xml:space="preserve"> </w:t>
+      </w:r>
+      <w:r>
+        <w:t xml:space="preserve">also</w:t>
+      </w:r>
+      <w:r>
+        <w:t xml:space="preserve"> </w:t>
+      </w:r>
+      <w:r>
+        <w:t xml:space="preserve">enables</w:t>
+      </w:r>
+      <w:r>
+        <w:t xml:space="preserve"> </w:t>
+      </w:r>
+      <w:r>
+        <w:t xml:space="preserve">600V-class</w:t>
+      </w:r>
+      <w:r>
+        <w:t xml:space="preserve"> </w:t>
+      </w:r>
+      <w:r>
+        <w:t xml:space="preserve">distribution</w:t>
+      </w:r>
+      <w:r>
+        <w:t xml:space="preserve"> </w:t>
+      </w:r>
+      <w:r>
+        <w:t xml:space="preserve">directly</w:t>
+      </w:r>
+      <w:r>
+        <w:t xml:space="preserve"> </w:t>
+      </w:r>
+      <w:r>
+        <w:t xml:space="preserve">to</w:t>
+      </w:r>
+      <w:r>
+        <w:t xml:space="preserve"> </w:t>
+      </w:r>
+      <w:r>
         <w:t xml:space="preserve">the</w:t>
       </w:r>
       <w:r>
         <w:t xml:space="preserve"> </w:t>
       </w:r>
       <w:r>
-        <w:t xml:space="preserve">title</w:t>
-      </w:r>
-      <w:r>
-        <w:t xml:space="preserve"> </w:t>
-      </w:r>
-      <w:r>
-        <w:t xml:space="preserve">page</w:t>
-      </w:r>
-      <w:r>
-        <w:t xml:space="preserve"> </w:t>
-      </w:r>
-      <w:r>
-        <w:t xml:space="preserve">of</w:t>
+        <w:t xml:space="preserve">building</w:t>
+      </w:r>
+      <w:r>
+        <w:t xml:space="preserve"> </w:t>
+      </w:r>
+      <w:r>
+        <w:t xml:space="preserve">panel,</w:t>
+      </w:r>
+      <w:r>
+        <w:t xml:space="preserve"> </w:t>
+      </w:r>
+      <w:r>
+        <w:t xml:space="preserve">eliminating</w:t>
+      </w:r>
+      <w:r>
+        <w:t xml:space="preserve"> </w:t>
+      </w:r>
+      <w:r>
+        <w:t xml:space="preserve">a</w:t>
+      </w:r>
+      <w:r>
+        <w:t xml:space="preserve"> </w:t>
+      </w:r>
+      <w:r>
+        <w:t xml:space="preserve">transformer</w:t>
+      </w:r>
+      <w:r>
+        <w:t xml:space="preserve"> </w:t>
+      </w:r>
+      <w:r>
+        <w:t xml:space="preserve">tier</w:t>
+      </w:r>
+      <w:r>
+        <w:t xml:space="preserve"> </w:t>
+      </w:r>
+      <w:r>
+        <w:t xml:space="preserve">and</w:t>
+      </w:r>
+      <w:r>
+        <w:t xml:space="preserve"> </w:t>
+      </w:r>
+      <w:r>
+        <w:t xml:space="preserve">delivering</w:t>
+      </w:r>
+      <w:r>
+        <w:t xml:space="preserve"> </w:t>
+      </w:r>
+      <w:r>
+        <w:t xml:space="preserve">voltages</w:t>
+      </w:r>
+      <w:r>
+        <w:t xml:space="preserve"> </w:t>
+      </w:r>
+      <w:r>
+        <w:t xml:space="preserve">compatible</w:t>
+      </w:r>
+      <w:r>
+        <w:t xml:space="preserve"> </w:t>
+      </w:r>
+      <w:r>
+        <w:t xml:space="preserve">with</w:t>
       </w:r>
       <w:r>
         <w:t xml:space="preserve"> </w:t>
@@ -227,7 +1641,109 @@
         <w:t xml:space="preserve"> </w:t>
       </w:r>
       <w:r>
-        <w:t xml:space="preserve">PDF</w:t>
+        <w:t xml:space="preserve">global</w:t>
+      </w:r>
+      <w:r>
+        <w:t xml:space="preserve"> </w:t>
+      </w:r>
+      <w:r>
+        <w:t xml:space="preserve">380V</w:t>
+      </w:r>
+      <w:r>
+        <w:t xml:space="preserve"> </w:t>
+      </w:r>
+      <w:r>
+        <w:t xml:space="preserve">DC</w:t>
+      </w:r>
+      <w:r>
+        <w:t xml:space="preserve"> </w:t>
+      </w:r>
+      <w:r>
+        <w:t xml:space="preserve">equipment</w:t>
+      </w:r>
+      <w:r>
+        <w:t xml:space="preserve"> </w:t>
+      </w:r>
+      <w:r>
+        <w:t xml:space="preserve">ecosystem</w:t>
+      </w:r>
+      <w:r>
+        <w:t xml:space="preserve"> </w:t>
+      </w:r>
+      <w:r>
+        <w:t xml:space="preserve">through</w:t>
+      </w:r>
+      <w:r>
+        <w:t xml:space="preserve"> </w:t>
+      </w:r>
+      <w:r>
+        <w:t xml:space="preserve">simple</w:t>
+      </w:r>
+      <w:r>
+        <w:t xml:space="preserve"> </w:t>
+      </w:r>
+      <w:r>
+        <w:t xml:space="preserve">rectification.</w:t>
+      </w:r>
+      <w:r>
+        <w:t xml:space="preserve"> </w:t>
+      </w:r>
+      <w:r>
+        <w:t xml:space="preserve">The</w:t>
+      </w:r>
+      <w:r>
+        <w:t xml:space="preserve"> </w:t>
+      </w:r>
+      <w:r>
+        <w:t xml:space="preserve">architecture</w:t>
+      </w:r>
+      <w:r>
+        <w:t xml:space="preserve"> </w:t>
+      </w:r>
+      <w:r>
+        <w:t xml:space="preserve">applies</w:t>
+      </w:r>
+      <w:r>
+        <w:t xml:space="preserve"> </w:t>
+      </w:r>
+      <w:r>
+        <w:t xml:space="preserve">equally</w:t>
+      </w:r>
+      <w:r>
+        <w:t xml:space="preserve"> </w:t>
+      </w:r>
+      <w:r>
+        <w:t xml:space="preserve">to</w:t>
+      </w:r>
+      <w:r>
+        <w:t xml:space="preserve"> </w:t>
+      </w:r>
+      <w:r>
+        <w:t xml:space="preserve">post-conflict</w:t>
+      </w:r>
+      <w:r>
+        <w:t xml:space="preserve"> </w:t>
+      </w:r>
+      <w:r>
+        <w:t xml:space="preserve">reconstruction,</w:t>
+      </w:r>
+      <w:r>
+        <w:t xml:space="preserve"> </w:t>
+      </w:r>
+      <w:r>
+        <w:t xml:space="preserve">domestic</w:t>
+      </w:r>
+      <w:r>
+        <w:t xml:space="preserve"> </w:t>
+      </w:r>
+      <w:r>
+        <w:t xml:space="preserve">grid</w:t>
+      </w:r>
+      <w:r>
+        <w:t xml:space="preserve"> </w:t>
+      </w:r>
+      <w:r>
+        <w:t xml:space="preserve">expansion,</w:t>
       </w:r>
       <w:r>
         <w:t xml:space="preserve"> </w:t>
@@ -239,37 +1755,79 @@
         <w:t xml:space="preserve"> </w:t>
       </w:r>
       <w:r>
-        <w:t xml:space="preserve">as</w:t>
-      </w:r>
-      <w:r>
-        <w:t xml:space="preserve"> </w:t>
-      </w:r>
-      <w:r>
-        <w:t xml:space="preserve">the</w:t>
-      </w:r>
-      <w:r>
-        <w:t xml:space="preserve"> </w:t>
-      </w:r>
-      <w:r>
-        <w:t xml:space="preserve">opening</w:t>
-      </w:r>
-      <w:r>
-        <w:t xml:space="preserve"> </w:t>
-      </w:r>
-      <w:r>
-        <w:t xml:space="preserve">of</w:t>
-      </w:r>
-      <w:r>
-        <w:t xml:space="preserve"> </w:t>
-      </w:r>
-      <w:r>
-        <w:t xml:space="preserve">the</w:t>
-      </w:r>
-      <w:r>
-        <w:t xml:space="preserve"> </w:t>
-      </w:r>
-      <w:r>
-        <w:t xml:space="preserve">DOCX.]</w:t>
+        <w:t xml:space="preserve">rural</w:t>
+      </w:r>
+      <w:r>
+        <w:t xml:space="preserve"> </w:t>
+      </w:r>
+      <w:r>
+        <w:t xml:space="preserve">electrification</w:t>
+      </w:r>
+      <w:r>
+        <w:t xml:space="preserve"> </w:t>
+      </w:r>
+      <w:r>
+        <w:t xml:space="preserve">in</w:t>
+      </w:r>
+      <w:r>
+        <w:t xml:space="preserve"> </w:t>
+      </w:r>
+      <w:r>
+        <w:t xml:space="preserve">regions</w:t>
+      </w:r>
+      <w:r>
+        <w:t xml:space="preserve"> </w:t>
+      </w:r>
+      <w:r>
+        <w:t xml:space="preserve">where</w:t>
+      </w:r>
+      <w:r>
+        <w:t xml:space="preserve"> </w:t>
+      </w:r>
+      <w:r>
+        <w:t xml:space="preserve">conventional</w:t>
+      </w:r>
+      <w:r>
+        <w:t xml:space="preserve"> </w:t>
+      </w:r>
+      <w:r>
+        <w:t xml:space="preserve">procurement</w:t>
+      </w:r>
+      <w:r>
+        <w:t xml:space="preserve"> </w:t>
+      </w:r>
+      <w:r>
+        <w:t xml:space="preserve">timelines</w:t>
+      </w:r>
+      <w:r>
+        <w:t xml:space="preserve"> </w:t>
+      </w:r>
+      <w:r>
+        <w:t xml:space="preserve">make</w:t>
+      </w:r>
+      <w:r>
+        <w:t xml:space="preserve"> </w:t>
+      </w:r>
+      <w:r>
+        <w:t xml:space="preserve">grid</w:t>
+      </w:r>
+      <w:r>
+        <w:t xml:space="preserve"> </w:t>
+      </w:r>
+      <w:r>
+        <w:t xml:space="preserve">access</w:t>
+      </w:r>
+      <w:r>
+        <w:t xml:space="preserve"> </w:t>
+      </w:r>
+      <w:r>
+        <w:t xml:space="preserve">effectively</w:t>
+      </w:r>
+      <w:r>
+        <w:t xml:space="preserve"> </w:t>
+      </w:r>
+      <w:r>
+        <w:t xml:space="preserve">impossible.</w:t>
       </w:r>
     </w:p>
     <w:bookmarkStart w:id="20" w:name="introduction"/>

</xml_diff>

<commit_message>
Add table of contents to root README
Title, subtitle, and first-commit date on one line per paper.
Anchors link to the full abstracts below.

Co-Authored-By: Clod <clod@noreply.anthropic.com>
</commit_message>
<xml_diff>
--- a/dist/12hz-power-grid.docx
+++ b/dist/12hz-power-grid.docx
@@ -1839,8 +1839,8 @@
       </w:pPr>
       <w:r>
         <w:rPr>
+          <w:i/>
           <w:iCs/>
-          <w:i/>
         </w:rPr>
         <w:t xml:space="preserve">Replace this file with your actual paper.</w:t>
       </w:r>
@@ -1855,11 +1855,11 @@
     </w:p>
     <w:p>
       <w:pPr>
+        <w:pStyle w:val="Compact"/>
         <w:numPr>
           <w:ilvl w:val="0"/>
           <w:numId w:val="1001"/>
         </w:numPr>
-        <w:pStyle w:val="Compact"/>
       </w:pPr>
       <w:r>
         <w:t xml:space="preserve">Headings (</w:t>
@@ -1900,16 +1900,16 @@
     </w:p>
     <w:p>
       <w:pPr>
+        <w:pStyle w:val="Compact"/>
         <w:numPr>
           <w:ilvl w:val="0"/>
           <w:numId w:val="1001"/>
         </w:numPr>
-        <w:pStyle w:val="Compact"/>
       </w:pPr>
       <w:r>
         <w:rPr>
+          <w:b/>
           <w:bCs/>
-          <w:b/>
         </w:rPr>
         <w:t xml:space="preserve">Bold</w:t>
       </w:r>
@@ -1921,8 +1921,8 @@
       </w:r>
       <w:r>
         <w:rPr>
+          <w:i/>
           <w:iCs/>
-          <w:i/>
         </w:rPr>
         <w:t xml:space="preserve">italic</w:t>
       </w:r>
@@ -1941,11 +1941,11 @@
     </w:p>
     <w:p>
       <w:pPr>
+        <w:pStyle w:val="Compact"/>
         <w:numPr>
           <w:ilvl w:val="0"/>
           <w:numId w:val="1001"/>
         </w:numPr>
-        <w:pStyle w:val="Compact"/>
       </w:pPr>
       <w:r>
         <w:t xml:space="preserve">Tables, footnotes, citations</w:t>
@@ -1953,11 +1953,11 @@
     </w:p>
     <w:p>
       <w:pPr>
+        <w:pStyle w:val="Compact"/>
         <w:numPr>
           <w:ilvl w:val="0"/>
           <w:numId w:val="1001"/>
         </w:numPr>
-        <w:pStyle w:val="Compact"/>
       </w:pPr>
       <w:r>
         <w:t xml:space="preserve">Math:</w:t>
@@ -2093,7 +2093,7 @@
 <file path=word/numbering.xml><?xml version="1.0" encoding="utf-8"?>
 <w:numbering xmlns:w="http://schemas.openxmlformats.org/wordprocessingml/2006/main">
   <w:abstractNum w:abstractNumId="990">
-    <w:nsid w:val="A990"/>
+    <w:nsid w:val="0000A990"/>
     <w:multiLevelType w:val="multilevel"/>
     <w:lvl w:ilvl="0">
       <w:numFmt w:val="bullet"/>
@@ -2169,7 +2169,7 @@
     </w:lvl>
   </w:abstractNum>
   <w:abstractNum w:abstractNumId="991">
-    <w:nsid w:val="A991"/>
+    <w:nsid w:val="0000A991"/>
     <w:multiLevelType w:val="multilevel"/>
     <w:lvl w:ilvl="0">
       <w:numFmt w:val="bullet"/>
@@ -2762,8 +2762,8 @@
     <w:name w:val="KeywordTok"/>
     <w:basedOn w:val="VerbatimChar"/>
     <w:rPr>
+      <w:b/>
       <w:color w:val="007020"/>
-      <w:b/>
     </w:rPr>
   </w:style>
   <w:style w:type="character" w:customStyle="1" w:styleId="DataTypeTok">
@@ -2840,42 +2840,42 @@
     <w:name w:val="ImportTok"/>
     <w:basedOn w:val="VerbatimChar"/>
     <w:rPr>
+      <w:b/>
       <w:color w:val="008000"/>
-      <w:b/>
     </w:rPr>
   </w:style>
   <w:style w:type="character" w:customStyle="1" w:styleId="CommentTok">
     <w:name w:val="CommentTok"/>
     <w:basedOn w:val="VerbatimChar"/>
     <w:rPr>
+      <w:i/>
       <w:color w:val="60a0b0"/>
-      <w:i/>
     </w:rPr>
   </w:style>
   <w:style w:type="character" w:customStyle="1" w:styleId="DocumentationTok">
     <w:name w:val="DocumentationTok"/>
     <w:basedOn w:val="VerbatimChar"/>
     <w:rPr>
+      <w:i/>
       <w:color w:val="ba2121"/>
-      <w:i/>
     </w:rPr>
   </w:style>
   <w:style w:type="character" w:customStyle="1" w:styleId="AnnotationTok">
     <w:name w:val="AnnotationTok"/>
     <w:basedOn w:val="VerbatimChar"/>
     <w:rPr>
-      <w:color w:val="60a0b0"/>
       <w:b/>
       <w:i/>
+      <w:color w:val="60a0b0"/>
     </w:rPr>
   </w:style>
   <w:style w:type="character" w:customStyle="1" w:styleId="CommentVarTok">
     <w:name w:val="CommentVarTok"/>
     <w:basedOn w:val="VerbatimChar"/>
     <w:rPr>
-      <w:color w:val="60a0b0"/>
       <w:b/>
       <w:i/>
+      <w:color w:val="60a0b0"/>
     </w:rPr>
   </w:style>
   <w:style w:type="character" w:customStyle="1" w:styleId="OtherTok">
@@ -2903,8 +2903,8 @@
     <w:name w:val="ControlFlowTok"/>
     <w:basedOn w:val="VerbatimChar"/>
     <w:rPr>
+      <w:b/>
       <w:color w:val="007020"/>
-      <w:b/>
     </w:rPr>
   </w:style>
   <w:style w:type="character" w:customStyle="1" w:styleId="OperatorTok">
@@ -2949,34 +2949,34 @@
     <w:name w:val="InformationTok"/>
     <w:basedOn w:val="VerbatimChar"/>
     <w:rPr>
-      <w:color w:val="60a0b0"/>
       <w:b/>
       <w:i/>
+      <w:color w:val="60a0b0"/>
     </w:rPr>
   </w:style>
   <w:style w:type="character" w:customStyle="1" w:styleId="WarningTok">
     <w:name w:val="WarningTok"/>
     <w:basedOn w:val="VerbatimChar"/>
     <w:rPr>
-      <w:color w:val="60a0b0"/>
       <w:b/>
       <w:i/>
+      <w:color w:val="60a0b0"/>
     </w:rPr>
   </w:style>
   <w:style w:type="character" w:customStyle="1" w:styleId="AlertTok">
     <w:name w:val="AlertTok"/>
     <w:basedOn w:val="VerbatimChar"/>
     <w:rPr>
+      <w:b/>
       <w:color w:val="ff0000"/>
-      <w:b/>
     </w:rPr>
   </w:style>
   <w:style w:type="character" w:customStyle="1" w:styleId="ErrorTok">
     <w:name w:val="ErrorTok"/>
     <w:basedOn w:val="VerbatimChar"/>
     <w:rPr>
+      <w:b/>
       <w:color w:val="ff0000"/>
-      <w:b/>
     </w:rPr>
   </w:style>
   <w:style w:type="character" w:customStyle="1" w:styleId="NormalTok">

</xml_diff>

<commit_message>
Rebuild dist binaries from current sources
Co-Authored-By: Claude Opus 4.6 <noreply@anthropic.com>
</commit_message>
<xml_diff>
--- a/dist/12hz-power-grid.docx
+++ b/dist/12hz-power-grid.docx
@@ -57,13 +57,7 @@
         <w:pStyle w:val="Subtitle"/>
       </w:pPr>
       <w:r>
-        <w:t xml:space="preserve">Commodity-Steel</w:t>
-      </w:r>
-      <w:r>
-        <w:t xml:space="preserve"> </w:t>
-      </w:r>
-      <w:r>
-        <w:t xml:space="preserve">Transformers:</w:t>
+        <w:t xml:space="preserve">Solving</w:t>
       </w:r>
       <w:r>
         <w:t xml:space="preserve"> </w:t>
@@ -75,43 +69,25 @@
         <w:t xml:space="preserve"> </w:t>
       </w:r>
       <w:r>
-        <w:t xml:space="preserve">price</w:t>
-      </w:r>
-      <w:r>
-        <w:t xml:space="preserve"> </w:t>
-      </w:r>
-      <w:r>
-        <w:t xml:space="preserve">is</w:t>
-      </w:r>
-      <w:r>
-        <w:t xml:space="preserve"> </w:t>
-      </w:r>
-      <w:r>
-        <w:t xml:space="preserve">right,</w:t>
-      </w:r>
-      <w:r>
-        <w:t xml:space="preserve"> </w:t>
-      </w:r>
-      <w:r>
-        <w:t xml:space="preserve">the</w:t>
-      </w:r>
-      <w:r>
-        <w:t xml:space="preserve"> </w:t>
-      </w:r>
-      <w:r>
-        <w:t xml:space="preserve">time</w:t>
-      </w:r>
-      <w:r>
-        <w:t xml:space="preserve"> </w:t>
-      </w:r>
-      <w:r>
-        <w:t xml:space="preserve">is</w:t>
-      </w:r>
-      <w:r>
-        <w:t xml:space="preserve"> </w:t>
-      </w:r>
-      <w:r>
-        <w:t xml:space="preserve">right</w:t>
+        <w:t xml:space="preserve">Large</w:t>
+      </w:r>
+      <w:r>
+        <w:t xml:space="preserve"> </w:t>
+      </w:r>
+      <w:r>
+        <w:t xml:space="preserve">Power</w:t>
+      </w:r>
+      <w:r>
+        <w:t xml:space="preserve"> </w:t>
+      </w:r>
+      <w:r>
+        <w:t xml:space="preserve">Transformer</w:t>
+      </w:r>
+      <w:r>
+        <w:t xml:space="preserve"> </w:t>
+      </w:r>
+      <w:r>
+        <w:t xml:space="preserve">Problem</w:t>
       </w:r>
     </w:p>
     <w:p>

</xml_diff>

<commit_message>
Merge viking-poets-book, decentralize build system, auto-generate README
- Merge viking-poets-book git history via subtree at papers/viking-poets/
- Decentralize build: each papers/<slug>/Makefile defines its own rules
- Root Makefile uses explicit SUBDIRS list (one per line, comment to skip)
- viking-poets: Typst -> PDF, pandoc (cat chapters) -> DOCX
- .desc sidecar files for per-chapter title + description
- build/scripts/generate-readme.sh: README.md from DESCRIPTION.md + manifest
- _config.yml: remove dist from exclude (fixes 404)
- .gitignore: exclude papers/kamasutra/ (WIP)
- entfesselt: Makefile no-op (HTML/MD served as-is, PDF later)
- Private files (book plan, editorial analysis) moved to private/

Co-Authored-By: Claude <noreply@anthropic.com>
</commit_message>
<xml_diff>
--- a/dist/12hz-power-grid.docx
+++ b/dist/12hz-power-grid.docx
@@ -31,7 +31,7 @@
         <w:pStyle w:val="Date"/>
       </w:pPr>
       <w:r>
-        <w:t xml:space="preserve">2026-03-01</w:t>
+        <w:t xml:space="preserve">2026-07-01</w:t>
       </w:r>
     </w:p>
     <w:p>
@@ -418,7 +418,11 @@
       </w:r>
     </w:p>
     <w:bookmarkEnd w:id="10"/>
-    <w:sectPr/>
+    <w:sectPr>
+      <w:footnotePr>
+        <w:numRestart w:val="eachSect"/>
+      </w:footnotePr>
+    </w:sectPr>
   </w:body>
 </w:document>
 </file>
@@ -685,57 +689,94 @@
     <w:name w:val="Title"/>
     <w:basedOn w:val="Normal"/>
     <w:next w:val="BodyText"/>
-    <w:qFormat/>
-    <w:pPr>
-      <w:keepNext/>
-      <w:keepLines/>
-      <w:spacing w:after="240" w:before="480"/>
+    <w:link w:val="TitleChar"/>
+    <w:uiPriority w:val="10"/>
+    <w:qFormat/>
+    <w:rsid w:val="00A10FD9"/>
+    <w:pPr>
+      <w:spacing w:after="80" w:line="240" w:lineRule="auto"/>
+      <w:contextualSpacing/>
       <w:jc w:val="center"/>
     </w:pPr>
     <w:rPr>
       <w:rFonts w:asciiTheme="majorHAnsi" w:cstheme="majorBidi" w:eastAsiaTheme="majorEastAsia" w:hAnsiTheme="majorHAnsi"/>
-      <w:b/>
-      <w:bCs/>
-      <w:color w:themeColor="accent1" w:themeShade="B5" w:val="345A8A"/>
-      <w:sz w:val="36"/>
-      <w:szCs w:val="36"/>
+      <w:sz w:val="56"/>
+      <w:szCs w:val="56"/>
+    </w:rPr>
+  </w:style>
+  <w:style w:customStyle="1" w:styleId="TitleChar" w:type="character">
+    <w:name w:val="Title Char"/>
+    <w:basedOn w:val="DefaultParagraphFont"/>
+    <w:link w:val="Title"/>
+    <w:uiPriority w:val="10"/>
+    <w:rsid w:val="00A10FD9"/>
+    <w:rPr>
+      <w:rFonts w:asciiTheme="majorHAnsi" w:cstheme="majorBidi" w:eastAsiaTheme="majorEastAsia" w:hAnsiTheme="majorHAnsi"/>
+      <w:sz w:val="56"/>
+      <w:szCs w:val="56"/>
     </w:rPr>
   </w:style>
   <w:style w:styleId="Subtitle" w:type="paragraph">
     <w:name w:val="Subtitle"/>
     <w:basedOn w:val="Title"/>
     <w:next w:val="BodyText"/>
+    <w:link w:val="SubtitleChar"/>
+    <w:uiPriority w:val="11"/>
+    <w:qFormat/>
+    <w:rsid w:val="00A10FD9"/>
+    <w:pPr>
+      <w:numPr>
+        <w:ilvl w:val="1"/>
+      </w:numPr>
+    </w:pPr>
+    <w:rPr>
+      <w:rFonts w:cstheme="majorBidi" w:eastAsiaTheme="majorEastAsia"/>
+      <w:spacing w:val="15"/>
+      <w:sz w:val="28"/>
+      <w:szCs w:val="28"/>
+    </w:rPr>
+  </w:style>
+  <w:style w:customStyle="1" w:styleId="SubtitleChar" w:type="character">
+    <w:name w:val="Subtitle Char"/>
+    <w:basedOn w:val="DefaultParagraphFont"/>
+    <w:link w:val="Subtitle"/>
+    <w:uiPriority w:val="11"/>
+    <w:rsid w:val="00A10FD9"/>
+    <w:rPr>
+      <w:rFonts w:cstheme="majorBidi" w:eastAsiaTheme="majorEastAsia"/>
+      <w:color w:themeColor="text1" w:themeTint="A6" w:val="595959"/>
+      <w:spacing w:val="15"/>
+      <w:sz w:val="28"/>
+      <w:szCs w:val="28"/>
+    </w:rPr>
+  </w:style>
+  <w:style w:customStyle="1" w:styleId="Author" w:type="paragraph">
+    <w:name w:val="Author"/>
+    <w:basedOn w:val="Title"/>
+    <w:next w:val="BodyText"/>
     <w:qFormat/>
     <w:pPr>
       <w:keepNext/>
       <w:keepLines/>
-      <w:spacing w:after="240" w:before="240"/>
-      <w:jc w:val="center"/>
-    </w:pPr>
-    <w:rPr>
-      <w:sz w:val="30"/>
-      <w:szCs w:val="30"/>
-    </w:rPr>
-  </w:style>
-  <w:style w:customStyle="1" w:styleId="Author" w:type="paragraph">
-    <w:name w:val="Author"/>
+    </w:pPr>
+    <w:rPr>
+      <w:sz w:val="24"/>
+      <w:szCs w:val="24"/>
+    </w:rPr>
+  </w:style>
+  <w:style w:styleId="Date" w:type="paragraph">
+    <w:name w:val="Date"/>
+    <w:basedOn w:val="Title"/>
     <w:next w:val="BodyText"/>
     <w:qFormat/>
     <w:pPr>
       <w:keepNext/>
       <w:keepLines/>
-      <w:jc w:val="center"/>
-    </w:pPr>
-  </w:style>
-  <w:style w:styleId="Date" w:type="paragraph">
-    <w:name w:val="Date"/>
-    <w:next w:val="BodyText"/>
-    <w:qFormat/>
-    <w:pPr>
-      <w:keepNext/>
-      <w:keepLines/>
-      <w:jc w:val="center"/>
-    </w:pPr>
+    </w:pPr>
+    <w:rPr>
+      <w:sz w:val="24"/>
+      <w:szCs w:val="24"/>
+    </w:rPr>
   </w:style>
   <w:style w:customStyle="1" w:styleId="AbstractTitle" w:type="paragraph">
     <w:name w:val="Abstract Title"/>
@@ -750,7 +791,6 @@
     </w:pPr>
     <w:rPr>
       <w:b/>
-      <w:color w:val="345A8A"/>
       <w:sz w:val="20"/>
       <w:szCs w:val="20"/>
     </w:rPr>
@@ -779,191 +819,321 @@
     <w:rPr/>
   </w:style>
   <w:style w:styleId="Heading1" w:type="paragraph">
-    <w:name w:val="Heading 1"/>
+    <w:name w:val="heading 1"/>
     <w:basedOn w:val="Normal"/>
     <w:next w:val="BodyText"/>
-    <w:uiPriority w:val="9"/>
-    <w:qFormat/>
+    <w:link w:val="Heading1Char"/>
+    <w:uiPriority w:val="9"/>
+    <w:qFormat/>
+    <w:rsid w:val="00A10FD9"/>
     <w:pPr>
       <w:keepNext/>
       <w:keepLines/>
-      <w:spacing w:after="0" w:before="480"/>
+      <w:spacing w:after="80" w:before="360"/>
       <w:outlineLvl w:val="0"/>
     </w:pPr>
     <w:rPr>
       <w:rFonts w:asciiTheme="majorHAnsi" w:cstheme="majorBidi" w:eastAsiaTheme="majorEastAsia" w:hAnsiTheme="majorHAnsi"/>
-      <w:b/>
-      <w:bCs/>
-      <w:color w:themeColor="accent1" w:val="4F81BD"/>
+      <w:color w:themeColor="accent1" w:themeShade="BF" w:val="0F4761"/>
+      <w:sz w:val="40"/>
+      <w:szCs w:val="40"/>
+    </w:rPr>
+  </w:style>
+  <w:style w:styleId="Heading2" w:type="paragraph">
+    <w:name w:val="heading 2"/>
+    <w:basedOn w:val="Normal"/>
+    <w:next w:val="BodyText"/>
+    <w:link w:val="Heading2Char"/>
+    <w:uiPriority w:val="9"/>
+    <w:semiHidden/>
+    <w:unhideWhenUsed/>
+    <w:qFormat/>
+    <w:rsid w:val="00A10FD9"/>
+    <w:pPr>
+      <w:keepNext/>
+      <w:keepLines/>
+      <w:spacing w:after="80" w:before="160"/>
+      <w:outlineLvl w:val="1"/>
+    </w:pPr>
+    <w:rPr>
+      <w:rFonts w:asciiTheme="majorHAnsi" w:cstheme="majorBidi" w:eastAsiaTheme="majorEastAsia" w:hAnsiTheme="majorHAnsi"/>
+      <w:color w:themeColor="accent1" w:themeShade="BF" w:val="0F4761"/>
       <w:sz w:val="32"/>
       <w:szCs w:val="32"/>
     </w:rPr>
   </w:style>
-  <w:style w:styleId="Heading2" w:type="paragraph">
-    <w:name w:val="Heading 2"/>
+  <w:style w:styleId="Heading3" w:type="paragraph">
+    <w:name w:val="heading 3"/>
     <w:basedOn w:val="Normal"/>
     <w:next w:val="BodyText"/>
-    <w:uiPriority w:val="9"/>
+    <w:link w:val="Heading3Char"/>
+    <w:uiPriority w:val="9"/>
+    <w:semiHidden/>
     <w:unhideWhenUsed/>
     <w:qFormat/>
+    <w:rsid w:val="00A10FD9"/>
     <w:pPr>
       <w:keepNext/>
       <w:keepLines/>
-      <w:spacing w:after="0" w:before="200"/>
-      <w:outlineLvl w:val="1"/>
-    </w:pPr>
-    <w:rPr>
-      <w:rFonts w:asciiTheme="majorHAnsi" w:cstheme="majorBidi" w:eastAsiaTheme="majorEastAsia" w:hAnsiTheme="majorHAnsi"/>
-      <w:b/>
-      <w:bCs/>
-      <w:color w:themeColor="accent1" w:val="4F81BD"/>
+      <w:spacing w:after="80" w:before="160"/>
+      <w:outlineLvl w:val="2"/>
+    </w:pPr>
+    <w:rPr>
+      <w:rFonts w:cstheme="majorBidi" w:eastAsiaTheme="majorEastAsia"/>
+      <w:color w:themeColor="accent1" w:themeShade="BF" w:val="0F4761"/>
       <w:sz w:val="28"/>
       <w:szCs w:val="28"/>
     </w:rPr>
   </w:style>
-  <w:style w:styleId="Heading3" w:type="paragraph">
-    <w:name w:val="Heading 3"/>
+  <w:style w:styleId="Heading4" w:type="paragraph">
+    <w:name w:val="heading 4"/>
     <w:basedOn w:val="Normal"/>
     <w:next w:val="BodyText"/>
-    <w:uiPriority w:val="9"/>
+    <w:link w:val="Heading4Char"/>
+    <w:uiPriority w:val="9"/>
+    <w:semiHidden/>
     <w:unhideWhenUsed/>
     <w:qFormat/>
+    <w:rsid w:val="00A10FD9"/>
     <w:pPr>
       <w:keepNext/>
       <w:keepLines/>
-      <w:spacing w:after="0" w:before="200"/>
-      <w:outlineLvl w:val="2"/>
-    </w:pPr>
-    <w:rPr>
-      <w:rFonts w:asciiTheme="majorHAnsi" w:cstheme="majorBidi" w:eastAsiaTheme="majorEastAsia" w:hAnsiTheme="majorHAnsi"/>
-      <w:b/>
-      <w:bCs/>
-      <w:color w:themeColor="accent1" w:val="4F81BD"/>
-      <w:sz w:val="24"/>
-      <w:szCs w:val="24"/>
-    </w:rPr>
-  </w:style>
-  <w:style w:styleId="Heading4" w:type="paragraph">
-    <w:name w:val="Heading 4"/>
+      <w:spacing w:after="40" w:before="80"/>
+      <w:outlineLvl w:val="3"/>
+    </w:pPr>
+    <w:rPr>
+      <w:rFonts w:cstheme="majorBidi" w:eastAsiaTheme="majorEastAsia"/>
+      <w:i/>
+      <w:iCs/>
+      <w:color w:themeColor="accent1" w:themeShade="BF" w:val="0F4761"/>
+    </w:rPr>
+  </w:style>
+  <w:style w:styleId="Heading5" w:type="paragraph">
+    <w:name w:val="heading 5"/>
     <w:basedOn w:val="Normal"/>
     <w:next w:val="BodyText"/>
-    <w:uiPriority w:val="9"/>
+    <w:link w:val="Heading5Char"/>
+    <w:uiPriority w:val="9"/>
+    <w:semiHidden/>
     <w:unhideWhenUsed/>
     <w:qFormat/>
+    <w:rsid w:val="00A10FD9"/>
     <w:pPr>
       <w:keepNext/>
       <w:keepLines/>
-      <w:spacing w:after="0" w:before="200"/>
-      <w:outlineLvl w:val="3"/>
-    </w:pPr>
-    <w:rPr>
-      <w:rFonts w:asciiTheme="majorHAnsi" w:cstheme="majorBidi" w:eastAsiaTheme="majorEastAsia" w:hAnsiTheme="majorHAnsi"/>
-      <w:bCs/>
-      <w:i/>
-      <w:color w:themeColor="accent1" w:val="4F81BD"/>
-      <w:sz w:val="24"/>
-      <w:szCs w:val="24"/>
-    </w:rPr>
-  </w:style>
-  <w:style w:styleId="Heading5" w:type="paragraph">
-    <w:name w:val="Heading 5"/>
+      <w:spacing w:after="40" w:before="80"/>
+      <w:outlineLvl w:val="4"/>
+    </w:pPr>
+    <w:rPr>
+      <w:rFonts w:cstheme="majorBidi" w:eastAsiaTheme="majorEastAsia"/>
+      <w:color w:themeColor="accent1" w:themeShade="BF" w:val="0F4761"/>
+    </w:rPr>
+  </w:style>
+  <w:style w:styleId="Heading6" w:type="paragraph">
+    <w:name w:val="heading 6"/>
     <w:basedOn w:val="Normal"/>
     <w:next w:val="BodyText"/>
-    <w:uiPriority w:val="9"/>
+    <w:link w:val="Heading6Char"/>
+    <w:uiPriority w:val="9"/>
+    <w:semiHidden/>
     <w:unhideWhenUsed/>
     <w:qFormat/>
+    <w:rsid w:val="00A10FD9"/>
     <w:pPr>
       <w:keepNext/>
       <w:keepLines/>
-      <w:spacing w:after="0" w:before="200"/>
-      <w:outlineLvl w:val="4"/>
-    </w:pPr>
-    <w:rPr>
-      <w:rFonts w:asciiTheme="majorHAnsi" w:cstheme="majorBidi" w:eastAsiaTheme="majorEastAsia" w:hAnsiTheme="majorHAnsi"/>
+      <w:spacing w:after="0" w:before="40"/>
+      <w:outlineLvl w:val="5"/>
+    </w:pPr>
+    <w:rPr>
+      <w:rFonts w:cstheme="majorBidi" w:eastAsiaTheme="majorEastAsia"/>
+      <w:i/>
       <w:iCs/>
-      <w:color w:themeColor="accent1" w:val="4F81BD"/>
-      <w:sz w:val="24"/>
-      <w:szCs w:val="24"/>
-    </w:rPr>
-  </w:style>
-  <w:style w:styleId="Heading6" w:type="paragraph">
-    <w:name w:val="Heading 6"/>
+      <w:color w:themeColor="text1" w:themeTint="A6" w:val="595959"/>
+    </w:rPr>
+  </w:style>
+  <w:style w:styleId="Heading7" w:type="paragraph">
+    <w:name w:val="heading 7"/>
     <w:basedOn w:val="Normal"/>
     <w:next w:val="BodyText"/>
-    <w:uiPriority w:val="9"/>
+    <w:link w:val="Heading7Char"/>
+    <w:uiPriority w:val="9"/>
+    <w:semiHidden/>
     <w:unhideWhenUsed/>
     <w:qFormat/>
+    <w:rsid w:val="00A10FD9"/>
     <w:pPr>
       <w:keepNext/>
       <w:keepLines/>
-      <w:spacing w:after="0" w:before="200"/>
-      <w:outlineLvl w:val="5"/>
-    </w:pPr>
-    <w:rPr>
-      <w:rFonts w:asciiTheme="majorHAnsi" w:cstheme="majorBidi" w:eastAsiaTheme="majorEastAsia" w:hAnsiTheme="majorHAnsi"/>
-      <w:color w:themeColor="accent1" w:val="4F81BD"/>
-      <w:sz w:val="24"/>
-      <w:szCs w:val="24"/>
-    </w:rPr>
-  </w:style>
-  <w:style w:styleId="Heading7" w:type="paragraph">
-    <w:name w:val="Heading 7"/>
+      <w:spacing w:after="0" w:before="40"/>
+      <w:outlineLvl w:val="6"/>
+    </w:pPr>
+    <w:rPr>
+      <w:rFonts w:cstheme="majorBidi" w:eastAsiaTheme="majorEastAsia"/>
+      <w:color w:themeColor="text1" w:themeTint="A6" w:val="595959"/>
+    </w:rPr>
+  </w:style>
+  <w:style w:styleId="Heading8" w:type="paragraph">
+    <w:name w:val="heading 8"/>
     <w:basedOn w:val="Normal"/>
     <w:next w:val="BodyText"/>
-    <w:uiPriority w:val="9"/>
+    <w:link w:val="Heading8Char"/>
+    <w:uiPriority w:val="9"/>
+    <w:semiHidden/>
     <w:unhideWhenUsed/>
     <w:qFormat/>
+    <w:rsid w:val="00A10FD9"/>
     <w:pPr>
       <w:keepNext/>
       <w:keepLines/>
-      <w:spacing w:after="0" w:before="200"/>
-      <w:outlineLvl w:val="6"/>
-    </w:pPr>
-    <w:rPr>
-      <w:rFonts w:asciiTheme="majorHAnsi" w:cstheme="majorBidi" w:eastAsiaTheme="majorEastAsia" w:hAnsiTheme="majorHAnsi"/>
-      <w:color w:themeColor="accent1" w:val="4F81BD"/>
-      <w:sz w:val="24"/>
-      <w:szCs w:val="24"/>
-    </w:rPr>
-  </w:style>
-  <w:style w:styleId="Heading8" w:type="paragraph">
-    <w:name w:val="Heading 8"/>
+      <w:spacing w:after="0"/>
+      <w:outlineLvl w:val="7"/>
+    </w:pPr>
+    <w:rPr>
+      <w:rFonts w:cstheme="majorBidi" w:eastAsiaTheme="majorEastAsia"/>
+      <w:i/>
+      <w:iCs/>
+      <w:color w:themeColor="text1" w:themeTint="D8" w:val="272727"/>
+    </w:rPr>
+  </w:style>
+  <w:style w:styleId="Heading9" w:type="paragraph">
+    <w:name w:val="heading 9"/>
     <w:basedOn w:val="Normal"/>
     <w:next w:val="BodyText"/>
-    <w:uiPriority w:val="9"/>
+    <w:link w:val="Heading9Char"/>
+    <w:uiPriority w:val="9"/>
+    <w:semiHidden/>
     <w:unhideWhenUsed/>
     <w:qFormat/>
+    <w:rsid w:val="00A10FD9"/>
     <w:pPr>
       <w:keepNext/>
       <w:keepLines/>
-      <w:spacing w:after="0" w:before="200"/>
-      <w:outlineLvl w:val="7"/>
-    </w:pPr>
+      <w:spacing w:after="0"/>
+      <w:outlineLvl w:val="8"/>
+    </w:pPr>
+    <w:rPr>
+      <w:rFonts w:cstheme="majorBidi" w:eastAsiaTheme="majorEastAsia"/>
+      <w:color w:themeColor="text1" w:themeTint="D8" w:val="272727"/>
+    </w:rPr>
+  </w:style>
+  <w:style w:customStyle="1" w:styleId="Heading1Char" w:type="character">
+    <w:name w:val="Heading 1 Char"/>
+    <w:basedOn w:val="DefaultParagraphFont"/>
+    <w:link w:val="Heading1"/>
+    <w:uiPriority w:val="9"/>
+    <w:rsid w:val="00A10FD9"/>
     <w:rPr>
       <w:rFonts w:asciiTheme="majorHAnsi" w:cstheme="majorBidi" w:eastAsiaTheme="majorEastAsia" w:hAnsiTheme="majorHAnsi"/>
-      <w:color w:themeColor="accent1" w:val="4F81BD"/>
-      <w:sz w:val="24"/>
-      <w:szCs w:val="24"/>
-    </w:rPr>
-  </w:style>
-  <w:style w:styleId="Heading9" w:type="paragraph">
-    <w:name w:val="Heading 9"/>
-    <w:basedOn w:val="Normal"/>
-    <w:next w:val="BodyText"/>
-    <w:uiPriority w:val="9"/>
-    <w:unhideWhenUsed/>
-    <w:qFormat/>
-    <w:pPr>
-      <w:keepNext/>
-      <w:keepLines/>
-      <w:spacing w:after="0" w:before="200"/>
-      <w:outlineLvl w:val="8"/>
-    </w:pPr>
+      <w:color w:themeColor="accent1" w:themeShade="BF" w:val="0F4761"/>
+      <w:sz w:val="40"/>
+      <w:szCs w:val="40"/>
+    </w:rPr>
+  </w:style>
+  <w:style w:customStyle="1" w:styleId="Heading2Char" w:type="character">
+    <w:name w:val="Heading 2 Char"/>
+    <w:basedOn w:val="DefaultParagraphFont"/>
+    <w:link w:val="Heading2"/>
+    <w:uiPriority w:val="9"/>
+    <w:semiHidden/>
+    <w:rsid w:val="00A10FD9"/>
     <w:rPr>
       <w:rFonts w:asciiTheme="majorHAnsi" w:cstheme="majorBidi" w:eastAsiaTheme="majorEastAsia" w:hAnsiTheme="majorHAnsi"/>
-      <w:color w:themeColor="accent1" w:val="4F81BD"/>
-      <w:sz w:val="24"/>
-      <w:szCs w:val="24"/>
+      <w:color w:themeColor="accent1" w:themeShade="BF" w:val="0F4761"/>
+      <w:sz w:val="32"/>
+      <w:szCs w:val="32"/>
+    </w:rPr>
+  </w:style>
+  <w:style w:customStyle="1" w:styleId="Heading3Char" w:type="character">
+    <w:name w:val="Heading 3 Char"/>
+    <w:basedOn w:val="DefaultParagraphFont"/>
+    <w:link w:val="Heading3"/>
+    <w:uiPriority w:val="9"/>
+    <w:semiHidden/>
+    <w:rsid w:val="00A10FD9"/>
+    <w:rPr>
+      <w:rFonts w:cstheme="majorBidi" w:eastAsiaTheme="majorEastAsia"/>
+      <w:color w:themeColor="accent1" w:themeShade="BF" w:val="0F4761"/>
+      <w:sz w:val="28"/>
+      <w:szCs w:val="28"/>
+    </w:rPr>
+  </w:style>
+  <w:style w:customStyle="1" w:styleId="Heading4Char" w:type="character">
+    <w:name w:val="Heading 4 Char"/>
+    <w:basedOn w:val="DefaultParagraphFont"/>
+    <w:link w:val="Heading4"/>
+    <w:uiPriority w:val="9"/>
+    <w:semiHidden/>
+    <w:rsid w:val="00A10FD9"/>
+    <w:rPr>
+      <w:rFonts w:cstheme="majorBidi" w:eastAsiaTheme="majorEastAsia"/>
+      <w:i/>
+      <w:iCs/>
+      <w:color w:themeColor="accent1" w:themeShade="BF" w:val="0F4761"/>
+    </w:rPr>
+  </w:style>
+  <w:style w:customStyle="1" w:styleId="Heading5Char" w:type="character">
+    <w:name w:val="Heading 5 Char"/>
+    <w:basedOn w:val="DefaultParagraphFont"/>
+    <w:link w:val="Heading5"/>
+    <w:uiPriority w:val="9"/>
+    <w:semiHidden/>
+    <w:rsid w:val="00A10FD9"/>
+    <w:rPr>
+      <w:rFonts w:cstheme="majorBidi" w:eastAsiaTheme="majorEastAsia"/>
+      <w:color w:themeColor="accent1" w:themeShade="BF" w:val="0F4761"/>
+    </w:rPr>
+  </w:style>
+  <w:style w:customStyle="1" w:styleId="Heading6Char" w:type="character">
+    <w:name w:val="Heading 6 Char"/>
+    <w:basedOn w:val="DefaultParagraphFont"/>
+    <w:link w:val="Heading6"/>
+    <w:uiPriority w:val="9"/>
+    <w:semiHidden/>
+    <w:rsid w:val="00A10FD9"/>
+    <w:rPr>
+      <w:rFonts w:cstheme="majorBidi" w:eastAsiaTheme="majorEastAsia"/>
+      <w:i/>
+      <w:iCs/>
+      <w:color w:themeColor="text1" w:themeTint="A6" w:val="595959"/>
+    </w:rPr>
+  </w:style>
+  <w:style w:customStyle="1" w:styleId="Heading7Char" w:type="character">
+    <w:name w:val="Heading 7 Char"/>
+    <w:basedOn w:val="DefaultParagraphFont"/>
+    <w:link w:val="Heading7"/>
+    <w:uiPriority w:val="9"/>
+    <w:semiHidden/>
+    <w:rsid w:val="00A10FD9"/>
+    <w:rPr>
+      <w:rFonts w:cstheme="majorBidi" w:eastAsiaTheme="majorEastAsia"/>
+      <w:color w:themeColor="text1" w:themeTint="A6" w:val="595959"/>
+    </w:rPr>
+  </w:style>
+  <w:style w:customStyle="1" w:styleId="Heading8Char" w:type="character">
+    <w:name w:val="Heading 8 Char"/>
+    <w:basedOn w:val="DefaultParagraphFont"/>
+    <w:link w:val="Heading8"/>
+    <w:uiPriority w:val="9"/>
+    <w:semiHidden/>
+    <w:rsid w:val="00A10FD9"/>
+    <w:rPr>
+      <w:rFonts w:cstheme="majorBidi" w:eastAsiaTheme="majorEastAsia"/>
+      <w:i/>
+      <w:iCs/>
+      <w:color w:themeColor="text1" w:themeTint="D8" w:val="272727"/>
+    </w:rPr>
+  </w:style>
+  <w:style w:customStyle="1" w:styleId="Heading9Char" w:type="character">
+    <w:name w:val="Heading 9 Char"/>
+    <w:basedOn w:val="DefaultParagraphFont"/>
+    <w:link w:val="Heading9"/>
+    <w:uiPriority w:val="9"/>
+    <w:semiHidden/>
+    <w:rsid w:val="00A10FD9"/>
+    <w:rPr>
+      <w:rFonts w:cstheme="majorBidi" w:eastAsiaTheme="majorEastAsia"/>
+      <w:color w:themeColor="text1" w:themeTint="D8" w:val="272727"/>
     </w:rPr>
   </w:style>
   <w:style w:styleId="BlockText" w:type="paragraph">
@@ -988,8 +1158,8 @@
   </w:style>
   <w:style w:styleId="FootnoteBlockText" w:type="paragraph">
     <w:name w:val="Footnote Block Text"/>
-    <w:basedOn w:val="Footnote Text"/>
-    <w:next w:val="Footnote Text"/>
+    <w:basedOn w:val="FootnoteText"/>
+    <w:next w:val="FootnoteText"/>
     <w:uiPriority w:val="9"/>
     <w:unhideWhenUsed/>
     <w:qFormat/>
@@ -1381,44 +1551,44 @@
         <a:sysClr val="window" lastClr="FFFFFF"/>
       </a:lt1>
       <a:dk2>
-        <a:srgbClr val="1F497D"/>
+        <a:srgbClr val="0E2841"/>
       </a:dk2>
       <a:lt2>
-        <a:srgbClr val="EEECE1"/>
+        <a:srgbClr val="E8E8E8"/>
       </a:lt2>
       <a:accent1>
-        <a:srgbClr val="4F81BD"/>
+        <a:srgbClr val="156082"/>
       </a:accent1>
       <a:accent2>
-        <a:srgbClr val="C0504D"/>
+        <a:srgbClr val="E97132"/>
       </a:accent2>
       <a:accent3>
-        <a:srgbClr val="9BBB59"/>
+        <a:srgbClr val="196B24"/>
       </a:accent3>
       <a:accent4>
-        <a:srgbClr val="8064A2"/>
+        <a:srgbClr val="0F9ED5"/>
       </a:accent4>
       <a:accent5>
-        <a:srgbClr val="4BACC6"/>
+        <a:srgbClr val="A02B93"/>
       </a:accent5>
       <a:accent6>
-        <a:srgbClr val="F79646"/>
+        <a:srgbClr val="4EA72E"/>
       </a:accent6>
       <a:hlink>
-        <a:srgbClr val="0000FF"/>
+        <a:srgbClr val="467886"/>
       </a:hlink>
       <a:folHlink>
-        <a:srgbClr val="800080"/>
+        <a:srgbClr val="96607D"/>
       </a:folHlink>
     </a:clrScheme>
     <a:fontScheme name="Office">
       <a:majorFont>
-        <a:latin typeface="Calibri"/>
+        <a:latin typeface="Aptos Display" panose="02110004020202020204"/>
         <a:ea typeface=""/>
         <a:cs typeface=""/>
-        <a:font script="Jpan" typeface="ＭＳ ゴシック"/>
+        <a:font script="Jpan" typeface="游ゴシック Light"/>
         <a:font script="Hang" typeface="맑은 고딕"/>
-        <a:font script="Hans" typeface="宋体"/>
+        <a:font script="Hans" typeface="等线 Light"/>
         <a:font script="Hant" typeface="新細明體"/>
         <a:font script="Arab" typeface="Times New Roman"/>
         <a:font script="Hebr" typeface="Times New Roman"/>
@@ -1445,14 +1615,32 @@
         <a:font script="Mong" typeface="Mongolian Baiti"/>
         <a:font script="Viet" typeface="Times New Roman"/>
         <a:font script="Uigh" typeface="Microsoft Uighur"/>
+        <a:font script="Geor" typeface="Sylfaen"/>
+        <a:font script="Armn" typeface="Arial"/>
+        <a:font script="Bugi" typeface="Leelawadee UI"/>
+        <a:font script="Bopo" typeface="Microsoft JhengHei"/>
+        <a:font script="Java" typeface="Javanese Text"/>
+        <a:font script="Lisu" typeface="Segoe UI"/>
+        <a:font script="Mymr" typeface="Myanmar Text"/>
+        <a:font script="Nkoo" typeface="Ebrima"/>
+        <a:font script="Olck" typeface="Nirmala UI"/>
+        <a:font script="Osma" typeface="Ebrima"/>
+        <a:font script="Phag" typeface="Phagspa"/>
+        <a:font script="Syrn" typeface="Estrangelo Edessa"/>
+        <a:font script="Syrj" typeface="Estrangelo Edessa"/>
+        <a:font script="Syre" typeface="Estrangelo Edessa"/>
+        <a:font script="Sora" typeface="Nirmala UI"/>
+        <a:font script="Tale" typeface="Microsoft Tai Le"/>
+        <a:font script="Talu" typeface="Microsoft New Tai Lue"/>
+        <a:font script="Tfng" typeface="Ebrima"/>
       </a:majorFont>
       <a:minorFont>
-        <a:latin typeface="Cambria"/>
+        <a:latin typeface="Aptos" panose="02110004020202020204"/>
         <a:ea typeface=""/>
         <a:cs typeface=""/>
-        <a:font script="Jpan" typeface="ＭＳ 明朝"/>
+        <a:font script="Jpan" typeface="游明朝"/>
         <a:font script="Hang" typeface="맑은 고딕"/>
-        <a:font script="Hans" typeface="宋体"/>
+        <a:font script="Hans" typeface="等线"/>
         <a:font script="Hant" typeface="新細明體"/>
         <a:font script="Arab" typeface="Arial"/>
         <a:font script="Hebr" typeface="Arial"/>
@@ -1479,6 +1667,24 @@
         <a:font script="Mong" typeface="Mongolian Baiti"/>
         <a:font script="Viet" typeface="Arial"/>
         <a:font script="Uigh" typeface="Microsoft Uighur"/>
+        <a:font script="Geor" typeface="Sylfaen"/>
+        <a:font script="Armn" typeface="Arial"/>
+        <a:font script="Bugi" typeface="Leelawadee UI"/>
+        <a:font script="Bopo" typeface="Microsoft JhengHei"/>
+        <a:font script="Java" typeface="Javanese Text"/>
+        <a:font script="Lisu" typeface="Segoe UI"/>
+        <a:font script="Mymr" typeface="Myanmar Text"/>
+        <a:font script="Nkoo" typeface="Ebrima"/>
+        <a:font script="Olck" typeface="Nirmala UI"/>
+        <a:font script="Osma" typeface="Ebrima"/>
+        <a:font script="Phag" typeface="Phagspa"/>
+        <a:font script="Syrn" typeface="Estrangelo Edessa"/>
+        <a:font script="Syrj" typeface="Estrangelo Edessa"/>
+        <a:font script="Syre" typeface="Estrangelo Edessa"/>
+        <a:font script="Sora" typeface="Nirmala UI"/>
+        <a:font script="Tale" typeface="Microsoft Tai Le"/>
+        <a:font script="Talu" typeface="Microsoft New Tai Lue"/>
+        <a:font script="Tfng" typeface="Ebrima"/>
       </a:minorFont>
     </a:fontScheme>
     <a:fmtScheme name="Office">
@@ -1490,200 +1696,141 @@
           <a:gsLst>
             <a:gs pos="0">
               <a:schemeClr val="phClr">
-                <a:tint val="50000"/>
-                <a:satMod val="300000"/>
+                <a:lumMod val="110000"/>
+                <a:satMod val="105000"/>
+                <a:tint val="67000"/>
               </a:schemeClr>
             </a:gs>
-            <a:gs pos="35000">
+            <a:gs pos="50000">
               <a:schemeClr val="phClr">
-                <a:tint val="37000"/>
-                <a:satMod val="300000"/>
+                <a:lumMod val="105000"/>
+                <a:satMod val="103000"/>
+                <a:tint val="73000"/>
               </a:schemeClr>
             </a:gs>
             <a:gs pos="100000">
               <a:schemeClr val="phClr">
-                <a:tint val="15000"/>
-                <a:satMod val="350000"/>
+                <a:lumMod val="105000"/>
+                <a:satMod val="109000"/>
+                <a:tint val="81000"/>
               </a:schemeClr>
             </a:gs>
           </a:gsLst>
-          <a:lin ang="16200000" scaled="1"/>
+          <a:lin ang="5400000" scaled="0"/>
         </a:gradFill>
         <a:gradFill rotWithShape="1">
           <a:gsLst>
             <a:gs pos="0">
               <a:schemeClr val="phClr">
-                <a:tint val="100000"/>
+                <a:satMod val="103000"/>
+                <a:lumMod val="102000"/>
+                <a:tint val="94000"/>
+              </a:schemeClr>
+            </a:gs>
+            <a:gs pos="50000">
+              <a:schemeClr val="phClr">
+                <a:satMod val="110000"/>
+                <a:lumMod val="100000"/>
                 <a:shade val="100000"/>
-                <a:satMod val="130000"/>
               </a:schemeClr>
             </a:gs>
             <a:gs pos="100000">
               <a:schemeClr val="phClr">
-                <a:tint val="50000"/>
-                <a:shade val="100000"/>
-                <a:satMod val="350000"/>
+                <a:lumMod val="99000"/>
+                <a:satMod val="120000"/>
+                <a:shade val="78000"/>
               </a:schemeClr>
             </a:gs>
           </a:gsLst>
-          <a:lin ang="16200000" scaled="0"/>
+          <a:lin ang="5400000" scaled="0"/>
         </a:gradFill>
       </a:fillStyleLst>
       <a:lnStyleLst>
-        <a:ln w="9525" cap="flat" cmpd="sng" algn="ctr">
-          <a:solidFill>
-            <a:schemeClr val="phClr">
-              <a:shade val="95000"/>
-              <a:satMod val="105000"/>
-            </a:schemeClr>
-          </a:solidFill>
-          <a:prstDash val="solid"/>
-        </a:ln>
-        <a:ln w="25400" cap="flat" cmpd="sng" algn="ctr">
+        <a:ln w="6350" cap="flat" cmpd="sng" algn="ctr">
           <a:solidFill>
             <a:schemeClr val="phClr"/>
           </a:solidFill>
           <a:prstDash val="solid"/>
+          <a:miter lim="800000"/>
         </a:ln>
-        <a:ln w="38100" cap="flat" cmpd="sng" algn="ctr">
+        <a:ln w="12700" cap="flat" cmpd="sng" algn="ctr">
           <a:solidFill>
             <a:schemeClr val="phClr"/>
           </a:solidFill>
           <a:prstDash val="solid"/>
+          <a:miter lim="800000"/>
+        </a:ln>
+        <a:ln w="19050" cap="flat" cmpd="sng" algn="ctr">
+          <a:solidFill>
+            <a:schemeClr val="phClr"/>
+          </a:solidFill>
+          <a:prstDash val="solid"/>
+          <a:miter lim="800000"/>
         </a:ln>
       </a:lnStyleLst>
       <a:effectStyleLst>
         <a:effectStyle>
+          <a:effectLst/>
+        </a:effectStyle>
+        <a:effectStyle>
+          <a:effectLst/>
+        </a:effectStyle>
+        <a:effectStyle>
           <a:effectLst>
-            <a:outerShdw blurRad="40000" dist="20000" dir="5400000" rotWithShape="0">
+            <a:outerShdw blurRad="57150" dist="19050" dir="5400000" algn="ctr" rotWithShape="0">
               <a:srgbClr val="000000">
-                <a:alpha val="38000"/>
+                <a:alpha val="63000"/>
               </a:srgbClr>
             </a:outerShdw>
           </a:effectLst>
-        </a:effectStyle>
-        <a:effectStyle>
-          <a:effectLst>
-            <a:outerShdw blurRad="40000" dist="23000" dir="5400000" rotWithShape="0">
-              <a:srgbClr val="000000">
-                <a:alpha val="35000"/>
-              </a:srgbClr>
-            </a:outerShdw>
-          </a:effectLst>
-        </a:effectStyle>
-        <a:effectStyle>
-          <a:effectLst>
-            <a:outerShdw blurRad="40000" dist="23000" dir="5400000" rotWithShape="0">
-              <a:srgbClr val="000000">
-                <a:alpha val="35000"/>
-              </a:srgbClr>
-            </a:outerShdw>
-          </a:effectLst>
-          <a:scene3d>
-            <a:camera prst="orthographicFront">
-              <a:rot lat="0" lon="0" rev="0"/>
-            </a:camera>
-            <a:lightRig rig="threePt" dir="t">
-              <a:rot lat="0" lon="0" rev="1200000"/>
-            </a:lightRig>
-          </a:scene3d>
-          <a:sp3d>
-            <a:bevelT w="63500" h="25400"/>
-          </a:sp3d>
         </a:effectStyle>
       </a:effectStyleLst>
       <a:bgFillStyleLst>
         <a:solidFill>
           <a:schemeClr val="phClr"/>
         </a:solidFill>
+        <a:solidFill>
+          <a:schemeClr val="phClr">
+            <a:tint val="95000"/>
+            <a:satMod val="170000"/>
+          </a:schemeClr>
+        </a:solidFill>
         <a:gradFill rotWithShape="1">
           <a:gsLst>
             <a:gs pos="0">
               <a:schemeClr val="phClr">
-                <a:tint val="40000"/>
-                <a:satMod val="350000"/>
+                <a:tint val="93000"/>
+                <a:satMod val="150000"/>
+                <a:shade val="98000"/>
+                <a:lumMod val="102000"/>
               </a:schemeClr>
             </a:gs>
-            <a:gs pos="40000">
+            <a:gs pos="50000">
               <a:schemeClr val="phClr">
-                <a:tint val="45000"/>
-                <a:shade val="99000"/>
-                <a:satMod val="350000"/>
+                <a:tint val="98000"/>
+                <a:satMod val="130000"/>
+                <a:shade val="90000"/>
+                <a:lumMod val="103000"/>
               </a:schemeClr>
             </a:gs>
             <a:gs pos="100000">
               <a:schemeClr val="phClr">
-                <a:shade val="20000"/>
-                <a:satMod val="255000"/>
+                <a:shade val="63000"/>
+                <a:satMod val="120000"/>
               </a:schemeClr>
             </a:gs>
           </a:gsLst>
-          <a:path path="circle">
-            <a:fillToRect l="50000" t="-80000" r="50000" b="180000"/>
-          </a:path>
-        </a:gradFill>
-        <a:gradFill rotWithShape="1">
-          <a:gsLst>
-            <a:gs pos="0">
-              <a:schemeClr val="phClr">
-                <a:tint val="80000"/>
-                <a:satMod val="300000"/>
-              </a:schemeClr>
-            </a:gs>
-            <a:gs pos="100000">
-              <a:schemeClr val="phClr">
-                <a:shade val="30000"/>
-                <a:satMod val="200000"/>
-              </a:schemeClr>
-            </a:gs>
-          </a:gsLst>
-          <a:path path="circle">
-            <a:fillToRect l="50000" t="50000" r="50000" b="50000"/>
-          </a:path>
+          <a:lin ang="5400000" scaled="0"/>
         </a:gradFill>
       </a:bgFillStyleLst>
     </a:fmtScheme>
   </a:themeElements>
-  <a:objectDefaults>
-    <a:spDef>
-      <a:spPr/>
-      <a:bodyPr/>
-      <a:lstStyle/>
-      <a:style>
-        <a:lnRef idx="1">
-          <a:schemeClr val="accent1"/>
-        </a:lnRef>
-        <a:fillRef idx="3">
-          <a:schemeClr val="accent1"/>
-        </a:fillRef>
-        <a:effectRef idx="2">
-          <a:schemeClr val="accent1"/>
-        </a:effectRef>
-        <a:fontRef idx="minor">
-          <a:schemeClr val="lt1"/>
-        </a:fontRef>
-      </a:style>
-    </a:spDef>
-    <a:lnDef>
-      <a:spPr/>
-      <a:bodyPr/>
-      <a:lstStyle/>
-      <a:style>
-        <a:lnRef idx="2">
-          <a:schemeClr val="accent1"/>
-        </a:lnRef>
-        <a:fillRef idx="0">
-          <a:schemeClr val="accent1"/>
-        </a:fillRef>
-        <a:effectRef idx="1">
-          <a:schemeClr val="accent1"/>
-        </a:effectRef>
-        <a:fontRef idx="minor">
-          <a:schemeClr val="tx1"/>
-        </a:fontRef>
-      </a:style>
-    </a:lnDef>
-  </a:objectDefaults>
+  <a:objectDefaults/>
   <a:extraClrSchemeLst/>
+  <a:extLst>
+    <a:ext uri="{05A4C25C-085E-4340-85A3-A5531E510DB2}">
+      <thm15:themeFamily xmlns:thm15="http://schemas.microsoft.com/office/thememl/2012/main" name="Office Theme" id="{2E142A2C-CD16-42D6-873A-C26D2A0506FA}" vid="{1BDDFF52-6CD6-40A5-AB3C-68EB2F1E4D0A}"/>
+    </a:ext>
+  </a:extLst>
 </a:theme>
 </file>
</xml_diff>